<commit_message>
Suivi de modifications : conserver les corrections des autres relecteurs + ajouter celles de Dr IBRAHIMA DIALLO
Les versions « suivi de modifications » repartent désormais du document
original : les modifications suivies et commentaires des autres relecteurs
(Ismael SAMBY, Jerry Kalonji, IB-OKAPI, Zhou Zilai) sont conservés intacts,
et les corrections du Dr IBRAHIMA DIALLO sont ajoutées par-dessus en
modifications suivies (w:ins/w:del).

- Corrections en ligne pour le texte courant ; pour les passages situés dans
  une insertion d'un autre relecteur, la correction est ajoutée comme
  insertion suivie autonome juste après le bloc concerné (sans imbrication).
- Vérifié : l'acceptation de toutes les modifications produit le texte corrigé,
  et les changements des autres relecteurs restent présents. Documents validés (XSD).

Co-Authored-By: Claude Opus 4.8 <noreply@anthropic.com>
Claude-Session: https://claude.ai/code/session_01JdPj9UbiVsj4tSmm6xDfYr
</commit_message>
<xml_diff>
--- a/Revue_EIES_WCAG_Dr_IBRAHIMA_DIALLO/1_Patrimoine_Culturel/PGPC_SUIVI_MODIFICATIONS_Dr_IBRAHIMA_DIALLO.docx
+++ b/Revue_EIES_WCAG_Dr_IBRAHIMA_DIALLO/1_Patrimoine_Culturel/PGPC_SUIVI_MODIFICATIONS_Dr_IBRAHIMA_DIALLO.docx
@@ -94,7 +94,7 @@
         </w:rPr>
         <w:t xml:space="preserve">WCAG reconnaît l'importance fondamentale de préserver le patrimoine culturel des communautés de la sous-préfecture de Kanfarandé, pour les générations présentes comme futures. Le présent Plan de Gestion du Patrimoine Culturel (PGPC) a été élaboré spécifiquement pour le Projet de raffinerie d'alumine et l'ensemble de ses composantes associées – la raffinerie d'alumine elle-même (procédé Bayer), la centrale électrique thermique (charbon, biomasse et photovoltaïque), la station de gazéification du charbon, l'installation de stockage des résidus de boues rouges, le barrage et le réservoir de prise d'eau brute, le port dédié à l'exportation de l'alumine, ainsi que les infrastructures de transport et de soutien associées – , implanté dans le district de Dobali, sur la rive sud du fleuve Kogon, à environ 20 km de son embouchure. Le présent s’aligne sur le cadre juridique guinéen notamment la constitution de 2025</w:t>
       </w:r>
-      <w:ins w:id="90001" w:author="Dr IBRAHIMA DIALLO" w:date="2026-08-17T12:00:00Z">
+      <w:ins w:id="90001" w:author="Dr IBRAHIMA DIALLO" w:date="2026-08-17T13:00:00Z">
         <w:r>
           <w:rPr>
             <w:rFonts w:ascii="Arial" w:eastAsia="Calibri" w:hAnsi="Arial" w:cs="Arial"/>
@@ -171,6 +171,7 @@
         <w:spacing w:before="0" w:beforeAutospacing="0" w:after="0" w:afterAutospacing="0" w:line="276" w:lineRule="auto"/>
         <w:jc w:val="both"/>
         <w:rPr>
+          <w:ins w:id="4" w:author="Ismael SAMBY" w:date="2026-08-10T16:26:00Z"/>
           <w:rFonts w:ascii="Arial" w:hAnsi="Arial" w:cs="Arial"/>
           <w:sz w:val="21"/>
           <w:szCs w:val="21"/>
@@ -182,53 +183,188 @@
           <w:sz w:val="21"/>
           <w:szCs w:val="21"/>
         </w:rPr>
-        <w:t xml:space="preserve">L'inventaire du patrimoine culturel réalisé par OKAPI en avril 2026 a couvert l'ensemble de l'emprise du Projet, incluant la raffinerie d'alumine, la centrale électrique thermique, la station de gazéification, l'installation de stockage des résidus de boues rouges, le barrage et le réservoir de prise d'eau brute, le port dédié à l'exportation de l'alumine, ainsi que les infrastructures de transport et de soutien associées. Cet inventaire a permis d'identifier cinq (5) sites patrimoniaux actifs, situés au sein des zones d'implantation de trois de ces composantes – l'installation de stockage des résidus de boues rouges, la raffinerie d'alumine et la centrale électrique (voir les coordonnées des sites patrimoniaux dans le tableau ci-dessous) –, dont trois présentent une importance élevée. Parmi ceux-ci, le site de Dawakaré (dans la localité de Kakourounty), situé à proximité immédiate de la centrale électrique, a été déclaré non destructible et non reproductible par ses détenteurs, ce qui en fait le site patrimonial le plus sensible du Projet, avec un périmètre de protection minimal de 200 mètres à respecter dans les plans d'exécution (Cf. Chapitre 8.3 </w:t>
-      </w:r>
+        <w:t xml:space="preserve">L'inventaire du patrimoine culturel réalisé par OKAPI en avril 2026 a couvert l'ensemble de l'emprise du Projet, incluant la raffinerie d'alumine, la centrale électrique thermique, la station de gazéification, l'installation de stockage des résidus de boues rouges, le barrage et le réservoir de prise d'eau brute, le port dédié à l'exportation de l'alumine, ainsi que les infrastructures de transport et de soutien associées. Cet inventaire a permis d'identifier cinq (5) sites patrimoniaux actifs, situés au sein des zones d'implantation de trois de ces composantes – l'installation de stockage des résidus de boues rouges, la raffinerie d'alumine et la centrale électrique (voir les coordonnées des sites patrimoniaux dans le tableau ci-dessous) –, dont trois présentent une importance élevée. Parmi ceux-ci, le site de Dawakaré (dans la localité de Kakourounty), situé à proximité immédiate de la centrale électrique, a été déclaré non destructible et non reproductible par ses détenteurs, ce qui en fait le site patrimonial le plus sensible du Projet, avec un périmètre de protection minimal de 200 mètres à respecter dans les plans d'exécution</w:t>
+      </w:r>
+      <w:ins w:id="5" w:author="Ismael SAMBY" w:date="2026-08-10T16:26:00Z">
+        <w:r>
+          <w:rPr>
+            <w:rFonts w:ascii="Arial" w:hAnsi="Arial" w:cs="Arial"/>
+            <w:sz w:val="21"/>
+            <w:szCs w:val="21"/>
+          </w:rPr>
+          <w:t xml:space="preserve"> (Cf. Chapitre</w:t>
+        </w:r>
+      </w:ins>
+      <w:ins w:id="6" w:author="Ismael SAMBY" w:date="2026-08-10T16:27:00Z">
+        <w:r>
+          <w:rPr>
+            <w:rFonts w:ascii="Arial" w:hAnsi="Arial" w:cs="Arial"/>
+            <w:sz w:val="21"/>
+            <w:szCs w:val="21"/>
+          </w:rPr>
+          <w:t xml:space="preserve"> 8.3 </w:t>
+        </w:r>
+      </w:ins>
+      <w:del w:id="7" w:author="Ismael SAMBY" w:date="2026-08-10T16:27:00Z">
+        <w:r>
+          <w:rPr>
+            <w:rFonts w:ascii="Arial" w:hAnsi="Arial" w:cs="Arial"/>
+            <w:i/>
+            <w:iCs/>
+            <w:sz w:val="21"/>
+            <w:szCs w:val="21"/>
+            <w:rPrChange w:id="8" w:author="Ismael SAMBY" w:date="2026-08-10T16:27:00Z">
+              <w:rPr>
+                <w:rFonts w:ascii="Arial" w:hAnsi="Arial" w:cs="Arial"/>
+                <w:sz w:val="21"/>
+                <w:szCs w:val="21"/>
+              </w:rPr>
+            </w:rPrChange>
+          </w:rPr>
+          <w:delText>.</w:delText>
+        </w:r>
+      </w:del>
+      <w:ins w:id="9" w:author="Ismael SAMBY" w:date="2026-08-10T16:27:00Z">
+        <w:r>
+          <w:rPr>
+            <w:rFonts w:ascii="Arial" w:hAnsi="Arial" w:cs="Arial"/>
+            <w:i/>
+            <w:iCs/>
+            <w:sz w:val="21"/>
+            <w:szCs w:val="21"/>
+            <w:rPrChange w:id="10" w:author="Ismael SAMBY" w:date="2026-08-10T16:27:00Z">
+              <w:rPr>
+                <w:rFonts w:ascii="Arial" w:hAnsi="Arial" w:cs="Arial"/>
+                <w:sz w:val="21"/>
+                <w:szCs w:val="21"/>
+              </w:rPr>
+            </w:rPrChange>
+          </w:rPr>
+          <w:t>Baseline</w:t>
+        </w:r>
+        <w:r>
+          <w:rPr>
+            <w:rFonts w:ascii="Arial" w:hAnsi="Arial" w:cs="Arial"/>
+            <w:sz w:val="21"/>
+            <w:szCs w:val="21"/>
+          </w:rPr>
+          <w:t>).</w:t>
+        </w:r>
+      </w:ins>
       <w:r>
         <w:rPr>
           <w:rFonts w:ascii="Arial" w:hAnsi="Arial" w:cs="Arial"/>
-          <w:i/>
-          <w:iCs/>
-          <w:sz w:val="21"/>
-          <w:szCs w:val="21"/>
-          <w:rPrChange w:id="10" w:author="Ismael SAMBY" w:date="2026-08-10T16:27:00Z">
+          <w:sz w:val="21"/>
+          <w:szCs w:val="21"/>
+        </w:rPr>
+        <w:t xml:space="preserve"> Le Tableau ci-dessous présente la liste des sites identifiés dans la zone d’étude. </w:t>
+      </w:r>
+    </w:p>
+    <w:p>
+      <w:pPr>
+        <w:rPr>
+          <w:ins w:id="11" w:author="Ismael SAMBY" w:date="2026-08-10T16:26:00Z"/>
+          <w:rFonts w:ascii="Arial" w:eastAsia="Times New Roman" w:hAnsi="Arial" w:cs="Arial"/>
+          <w:kern w:val="0"/>
+          <w:sz w:val="21"/>
+          <w:szCs w:val="21"/>
+          <w:lang w:val="fr-FR" w:eastAsia="fr-FR"/>
+          <w14:ligatures w14:val="none"/>
+        </w:rPr>
+      </w:pPr>
+      <w:ins w:id="12" w:author="Ismael SAMBY" w:date="2026-08-10T16:26:00Z">
+        <w:r>
+          <w:rPr>
+            <w:rFonts w:ascii="Arial" w:hAnsi="Arial" w:cs="Arial"/>
+            <w:sz w:val="21"/>
+            <w:szCs w:val="21"/>
+          </w:rPr>
+          <w:br w:type="page"/>
+        </w:r>
+      </w:ins>
+    </w:p>
+    <w:p>
+      <w:pPr>
+        <w:pStyle w:val="font-claude-response-body"/>
+        <w:spacing w:before="0" w:beforeAutospacing="0" w:after="0" w:afterAutospacing="0" w:line="276" w:lineRule="auto"/>
+        <w:jc w:val="both"/>
+        <w:rPr>
+          <w:ins w:id="13" w:author="Ismael SAMBY" w:date="2026-08-10T16:23:00Z"/>
+          <w:rFonts w:ascii="Arial" w:hAnsi="Arial" w:cs="Arial"/>
+          <w:sz w:val="21"/>
+          <w:szCs w:val="21"/>
+        </w:rPr>
+      </w:pPr>
+    </w:p>
+    <w:p>
+      <w:pPr>
+        <w:pStyle w:val="font-claude-response-body"/>
+        <w:spacing w:before="0" w:beforeAutospacing="0" w:after="0" w:afterAutospacing="0" w:line="276" w:lineRule="auto"/>
+        <w:jc w:val="both"/>
+        <w:rPr>
+          <w:rFonts w:ascii="Arial" w:hAnsi="Arial" w:cs="Arial"/>
+          <w:sz w:val="21"/>
+          <w:szCs w:val="21"/>
+        </w:rPr>
+      </w:pPr>
+    </w:p>
+    <w:p>
+      <w:pPr>
+        <w:pStyle w:val="font-claude-response-body"/>
+        <w:spacing w:before="0" w:beforeAutospacing="0" w:after="0" w:afterAutospacing="0" w:line="276" w:lineRule="auto"/>
+        <w:jc w:val="both"/>
+        <w:rPr>
+          <w:del w:id="14" w:author="Ismael SAMBY" w:date="2026-08-10T16:23:00Z"/>
+          <w:rFonts w:ascii="Arial" w:hAnsi="Arial" w:cs="Arial"/>
+          <w:sz w:val="21"/>
+          <w:szCs w:val="21"/>
+        </w:rPr>
+      </w:pPr>
+      <w:ins w:id="15" w:author="Jerry Kalonji" w:date="2026-08-10T14:00:00Z">
+        <w:del w:id="16" w:author="Ismael SAMBY" w:date="2026-08-10T16:23:00Z">
+          <w:r>
             <w:rPr>
               <w:rFonts w:ascii="Arial" w:hAnsi="Arial" w:cs="Arial"/>
               <w:sz w:val="21"/>
               <w:szCs w:val="21"/>
             </w:rPr>
-          </w:rPrChange>
-        </w:rPr>
-        <w:t>Baseline</w:t>
-      </w:r>
-      <w:r>
-        <w:rPr>
-          <w:rFonts w:ascii="Arial" w:hAnsi="Arial" w:cs="Arial"/>
-          <w:sz w:val="21"/>
-          <w:szCs w:val="21"/>
-        </w:rPr>
-        <w:t xml:space="preserve">). Le Tableau ci-dessous présente la liste des sites identifiés dans la zone d’étude. </w:t>
-      </w:r>
-    </w:p>
-    <w:p>
-      <w:pPr>
-        <w:rPr>
-          <w:rFonts w:ascii="Arial" w:eastAsia="Times New Roman" w:hAnsi="Arial" w:cs="Arial"/>
-          <w:kern w:val="0"/>
-          <w:sz w:val="21"/>
-          <w:szCs w:val="21"/>
-          <w:lang w:val="fr-FR" w:eastAsia="fr-FR"/>
-          <w14:ligatures w14:val="none"/>
-        </w:rPr>
-      </w:pPr>
-      <w:r>
-        <w:rPr>
-          <w:rFonts w:ascii="Arial" w:hAnsi="Arial" w:cs="Arial"/>
-          <w:sz w:val="21"/>
-          <w:szCs w:val="21"/>
-        </w:rPr>
-        <w:br w:type="page"/>
-      </w:r>
+            <w:delText xml:space="preserve">Tableau x : Sites des</w:delText>
+          </w:r>
+        </w:del>
+      </w:ins>
+      <w:ins w:id="17" w:author="Jerry Kalonji" w:date="2026-08-10T14:01:00Z">
+        <w:del w:id="18" w:author="Ismael SAMBY" w:date="2026-08-10T16:23:00Z">
+          <w:r>
+            <w:rPr>
+              <w:rFonts w:ascii="Arial" w:hAnsi="Arial" w:cs="Arial"/>
+              <w:sz w:val="21"/>
+              <w:szCs w:val="21"/>
+            </w:rPr>
+            <w:delText xml:space="preserve"> </w:delText>
+          </w:r>
+          <w:commentRangeStart w:id="19"/>
+          <w:r>
+            <w:rPr>
+              <w:rFonts w:ascii="Arial" w:hAnsi="Arial" w:cs="Arial"/>
+              <w:sz w:val="21"/>
+              <w:szCs w:val="21"/>
+            </w:rPr>
+            <w:delText>identifiés</w:delText>
+          </w:r>
+        </w:del>
+      </w:ins>
+      <w:commentRangeEnd w:id="19"/>
+      <w:del w:id="20" w:author="Ismael SAMBY" w:date="2026-08-10T16:23:00Z">
+        <w:r>
+          <w:rPr>
+            <w:rStyle w:val="Marquedecommentaire"/>
+            <w:rFonts w:ascii="Arial" w:hAnsi="Arial" w:cs="Arial"/>
+            <w:sz w:val="21"/>
+            <w:szCs w:val="21"/>
+          </w:rPr>
+          <w:commentReference w:id="19"/>
+        </w:r>
+      </w:del>
     </w:p>
     <w:p>
       <w:pPr>
@@ -236,68 +372,47 @@
         <w:spacing w:before="0" w:beforeAutospacing="0" w:after="0" w:afterAutospacing="0" w:line="276" w:lineRule="auto"/>
         <w:jc w:val="both"/>
         <w:rPr>
+          <w:ins w:id="21" w:author="Ismael SAMBY" w:date="2026-08-10T16:23:00Z"/>
           <w:rFonts w:ascii="Arial" w:hAnsi="Arial" w:cs="Arial"/>
           <w:sz w:val="21"/>
           <w:szCs w:val="21"/>
         </w:rPr>
       </w:pPr>
-    </w:p>
-    <w:p>
-      <w:pPr>
-        <w:pStyle w:val="font-claude-response-body"/>
-        <w:spacing w:before="0" w:beforeAutospacing="0" w:after="0" w:afterAutospacing="0" w:line="276" w:lineRule="auto"/>
-        <w:jc w:val="both"/>
-        <w:rPr>
-          <w:rFonts w:ascii="Arial" w:hAnsi="Arial" w:cs="Arial"/>
-          <w:sz w:val="21"/>
-          <w:szCs w:val="21"/>
-        </w:rPr>
-      </w:pPr>
-    </w:p>
-    <w:p>
-      <w:pPr>
-        <w:pStyle w:val="font-claude-response-body"/>
-        <w:spacing w:before="0" w:beforeAutospacing="0" w:after="0" w:afterAutospacing="0" w:line="276" w:lineRule="auto"/>
-        <w:jc w:val="both"/>
-        <w:rPr>
-          <w:rFonts w:ascii="Arial" w:hAnsi="Arial" w:cs="Arial"/>
-          <w:sz w:val="21"/>
-          <w:szCs w:val="21"/>
-        </w:rPr>
-      </w:pPr>
-      <w:r>
-        <w:rPr>
-          <w:rFonts w:ascii="Arial" w:hAnsi="Arial" w:cs="Arial"/>
-          <w:sz w:val="21"/>
-          <w:szCs w:val="21"/>
-          <w:rPrChange w:id="23" w:author="Ismael SAMBY" w:date="2026-08-10T16:23:00Z">
-            <w:rPr/>
-          </w:rPrChange>
-        </w:rPr>
-        <w:t xml:space="preserve">Tableau </w:t>
-      </w:r>
-      <w:r>
-        <w:rPr>
-          <w:rFonts w:ascii="Arial" w:hAnsi="Arial" w:cs="Arial"/>
-          <w:sz w:val="21"/>
-          <w:szCs w:val="21"/>
-          <w:rPrChange w:id="24" w:author="Ismael SAMBY" w:date="2026-08-10T16:23:00Z">
-            <w:rPr/>
-          </w:rPrChange>
-        </w:rPr>
-        <w:fldChar w:fldCharType="begin"/>
-      </w:r>
-      <w:r>
-        <w:rPr>
-          <w:rFonts w:ascii="Arial" w:hAnsi="Arial" w:cs="Arial"/>
-          <w:sz w:val="21"/>
-          <w:szCs w:val="21"/>
-          <w:rPrChange w:id="25" w:author="Ismael SAMBY" w:date="2026-08-10T16:23:00Z">
-            <w:rPr/>
-          </w:rPrChange>
-        </w:rPr>
-        <w:instrText xml:space="preserve"> SEQ Tableau \* ARABIC </w:instrText>
-      </w:r>
+      <w:ins w:id="22" w:author="Ismael SAMBY" w:date="2026-08-10T16:23:00Z">
+        <w:r>
+          <w:rPr>
+            <w:rFonts w:ascii="Arial" w:hAnsi="Arial" w:cs="Arial"/>
+            <w:sz w:val="21"/>
+            <w:szCs w:val="21"/>
+            <w:rPrChange w:id="23" w:author="Ismael SAMBY" w:date="2026-08-10T16:23:00Z">
+              <w:rPr/>
+            </w:rPrChange>
+          </w:rPr>
+          <w:t xml:space="preserve">Tableau </w:t>
+        </w:r>
+        <w:r>
+          <w:rPr>
+            <w:rFonts w:ascii="Arial" w:hAnsi="Arial" w:cs="Arial"/>
+            <w:sz w:val="21"/>
+            <w:szCs w:val="21"/>
+            <w:rPrChange w:id="24" w:author="Ismael SAMBY" w:date="2026-08-10T16:23:00Z">
+              <w:rPr/>
+            </w:rPrChange>
+          </w:rPr>
+          <w:fldChar w:fldCharType="begin"/>
+        </w:r>
+        <w:r>
+          <w:rPr>
+            <w:rFonts w:ascii="Arial" w:hAnsi="Arial" w:cs="Arial"/>
+            <w:sz w:val="21"/>
+            <w:szCs w:val="21"/>
+            <w:rPrChange w:id="25" w:author="Ismael SAMBY" w:date="2026-08-10T16:23:00Z">
+              <w:rPr/>
+            </w:rPrChange>
+          </w:rPr>
+          <w:instrText xml:space="preserve"> SEQ Tableau \* ARABIC </w:instrText>
+        </w:r>
+      </w:ins>
       <w:r>
         <w:rPr>
           <w:rFonts w:ascii="Arial" w:hAnsi="Arial" w:cs="Arial"/>
@@ -309,45 +424,86 @@
         </w:rPr>
         <w:fldChar w:fldCharType="separate"/>
       </w:r>
-      <w:r>
-        <w:rPr>
-          <w:rFonts w:ascii="Arial" w:hAnsi="Arial" w:cs="Arial"/>
-          <w:noProof/>
-          <w:sz w:val="21"/>
-          <w:szCs w:val="21"/>
-        </w:rPr>
-        <w:t>1</w:t>
-      </w:r>
-      <w:r>
-        <w:rPr>
-          <w:rFonts w:ascii="Arial" w:hAnsi="Arial" w:cs="Arial"/>
-          <w:sz w:val="21"/>
-          <w:szCs w:val="21"/>
-          <w:rPrChange w:id="29" w:author="Ismael SAMBY" w:date="2026-08-10T16:23:00Z">
-            <w:rPr/>
-          </w:rPrChange>
-        </w:rPr>
-        <w:fldChar w:fldCharType="end"/>
-      </w:r>
-      <w:r>
-        <w:rPr>
-          <w:rFonts w:ascii="Arial" w:hAnsi="Arial" w:cs="Arial"/>
-          <w:sz w:val="21"/>
-          <w:szCs w:val="21"/>
-          <w:rPrChange w:id="30" w:author="Ismael SAMBY" w:date="2026-08-10T16:23:00Z">
-            <w:rPr/>
-          </w:rPrChange>
-        </w:rPr>
-        <w:t> :</w:t>
-      </w:r>
-      <w:r>
-        <w:rPr>
-          <w:rFonts w:ascii="Arial" w:hAnsi="Arial" w:cs="Arial"/>
-          <w:sz w:val="21"/>
-          <w:szCs w:val="21"/>
-        </w:rPr>
-        <w:t xml:space="preserve"> Sites des identifiés</w:t>
-      </w:r>
+      <w:ins w:id="27" w:author="Ismael SAMBY" w:date="2026-08-10T16:24:00Z">
+        <w:r>
+          <w:rPr>
+            <w:rFonts w:ascii="Arial" w:hAnsi="Arial" w:cs="Arial"/>
+            <w:noProof/>
+            <w:sz w:val="21"/>
+            <w:szCs w:val="21"/>
+          </w:rPr>
+          <w:t>1</w:t>
+        </w:r>
+      </w:ins>
+      <w:ins w:id="28" w:author="Ismael SAMBY" w:date="2026-08-10T16:23:00Z">
+        <w:r>
+          <w:rPr>
+            <w:rFonts w:ascii="Arial" w:hAnsi="Arial" w:cs="Arial"/>
+            <w:sz w:val="21"/>
+            <w:szCs w:val="21"/>
+            <w:rPrChange w:id="29" w:author="Ismael SAMBY" w:date="2026-08-10T16:23:00Z">
+              <w:rPr/>
+            </w:rPrChange>
+          </w:rPr>
+          <w:fldChar w:fldCharType="end"/>
+        </w:r>
+        <w:r>
+          <w:rPr>
+            <w:rFonts w:ascii="Arial" w:hAnsi="Arial" w:cs="Arial"/>
+            <w:sz w:val="21"/>
+            <w:szCs w:val="21"/>
+            <w:rPrChange w:id="30" w:author="Ismael SAMBY" w:date="2026-08-10T16:23:00Z">
+              <w:rPr/>
+            </w:rPrChange>
+          </w:rPr>
+          <w:t> :</w:t>
+        </w:r>
+        <w:r>
+          <w:rPr>
+            <w:rFonts w:ascii="Arial" w:hAnsi="Arial" w:cs="Arial"/>
+            <w:sz w:val="21"/>
+            <w:szCs w:val="21"/>
+          </w:rPr>
+          <w:t xml:space="preserve"> Sites des </w:t>
+        </w:r>
+        <w:commentRangeStart w:id="31"/>
+        <w:commentRangeStart w:id="32"/>
+        <w:r>
+          <w:rPr>
+            <w:rFonts w:ascii="Arial" w:hAnsi="Arial" w:cs="Arial"/>
+            <w:sz w:val="21"/>
+            <w:szCs w:val="21"/>
+          </w:rPr>
+          <w:t>identifiés</w:t>
+        </w:r>
+        <w:commentRangeEnd w:id="31"/>
+        <w:r>
+          <w:rPr>
+            <w:rPrChange w:id="33" w:author="Ismael SAMBY" w:date="2026-08-10T16:23:00Z">
+              <w:rPr>
+                <w:rStyle w:val="Marquedecommentaire"/>
+                <w:rFonts w:ascii="Arial" w:hAnsi="Arial" w:cs="Arial"/>
+                <w:sz w:val="21"/>
+                <w:szCs w:val="21"/>
+              </w:rPr>
+            </w:rPrChange>
+          </w:rPr>
+          <w:commentReference w:id="31"/>
+        </w:r>
+      </w:ins>
+      <w:commentRangeEnd w:id="32"/>
+      <w:ins w:id="34" w:author="Ismael SAMBY" w:date="2026-08-10T16:29:00Z">
+        <w:r>
+          <w:rPr>
+            <w:rStyle w:val="Marquedecommentaire"/>
+            <w:rFonts w:asciiTheme="minorHAnsi" w:eastAsiaTheme="minorHAnsi" w:hAnsiTheme="minorHAnsi" w:cstheme="minorBidi"/>
+            <w:kern w:val="2"/>
+            <w:lang w:val="fr-CA" w:eastAsia="en-US"/>
+            <w14:ligatures w14:val="standardContextual"/>
+          </w:rPr>
+          <w:commentReference w:id="32"/>
+        </w:r>
+      </w:ins>
     </w:p>
     <w:p>
       <w:pPr>
@@ -355,11 +511,14 @@
         <w:spacing w:before="0" w:beforeAutospacing="0" w:after="0" w:afterAutospacing="0" w:line="276" w:lineRule="auto"/>
         <w:jc w:val="both"/>
         <w:rPr>
+          <w:ins w:id="35" w:author="Ismael SAMBY" w:date="2026-08-10T16:23:00Z"/>
           <w:rFonts w:ascii="Arial" w:hAnsi="Arial" w:cs="Arial"/>
           <w:sz w:val="21"/>
           <w:szCs w:val="21"/>
           <w:rPrChange w:id="36" w:author="Ismael SAMBY" w:date="2026-08-10T16:23:00Z">
-            <w:rPr/>
+            <w:rPr>
+              <w:ins w:id="37" w:author="Ismael SAMBY" w:date="2026-08-10T16:23:00Z"/>
+            </w:rPr>
           </w:rPrChange>
         </w:rPr>
         <w:pPrChange w:id="38" w:author="Ismael SAMBY" w:date="2026-08-10T16:23:00Z">
@@ -1341,6 +1500,20 @@
         </w:rPr>
         <w:t>Objectif</w:t>
       </w:r>
+      <w:del w:id="75" w:author="Jerry Kalonji" w:date="2026-08-10T14:02:00Z">
+        <w:r>
+          <w:rPr>
+            <w:rFonts w:ascii="Arial" w:eastAsia="Times New Roman" w:hAnsi="Arial" w:cs="Arial"/>
+            <w:b/>
+            <w:kern w:val="0"/>
+            <w:sz w:val="21"/>
+            <w:szCs w:val="21"/>
+            <w:lang w:val="fr-FR"/>
+            <w14:ligatures w14:val="none"/>
+          </w:rPr>
+          <w:delText>s</w:delText>
+        </w:r>
+      </w:del>
       <w:bookmarkEnd w:id="71"/>
       <w:bookmarkEnd w:id="72"/>
       <w:bookmarkEnd w:id="73"/>
@@ -1421,7 +1594,105 @@
           <w:lang w:val="fr-FR"/>
           <w14:ligatures w14:val="none"/>
         </w:rPr>
-        <w:t xml:space="preserve">Promouvoir la sensibilisation et la protection du patrimoine culturel et des sites sacrés du projet de WCAG et veiller à ce que WCAG se conforme pleinement à la législation en vigueur et soutienne la protection et la préservation de toutes les formes de patrimoine culturel contre les impacts négatifs de ses activités. </w:t>
+        <w:t xml:space="preserve">Promouvoir la sensibilisation et la protection du patrimoine culturel et des sites sacrés du projet de WCAG et </w:t>
+      </w:r>
+      <w:del w:id="76" w:author="Jerry Kalonji" w:date="2026-08-10T14:03:00Z">
+        <w:r>
+          <w:rPr>
+            <w:rFonts w:ascii="Arial" w:eastAsia="Calibri" w:hAnsi="Arial" w:cs="Arial"/>
+            <w:kern w:val="0"/>
+            <w:sz w:val="21"/>
+            <w:szCs w:val="21"/>
+            <w:lang w:val="fr-FR"/>
+            <w14:ligatures w14:val="none"/>
+          </w:rPr>
+          <w:delText xml:space="preserve">Veiller </w:delText>
+        </w:r>
+      </w:del>
+      <w:ins w:id="77" w:author="Jerry Kalonji" w:date="2026-08-10T14:03:00Z">
+        <w:r>
+          <w:rPr>
+            <w:rFonts w:ascii="Arial" w:eastAsia="Calibri" w:hAnsi="Arial" w:cs="Arial"/>
+            <w:kern w:val="0"/>
+            <w:sz w:val="21"/>
+            <w:szCs w:val="21"/>
+            <w:lang w:val="fr-FR"/>
+            <w14:ligatures w14:val="none"/>
+          </w:rPr>
+          <w:t xml:space="preserve">veiller </w:t>
+        </w:r>
+      </w:ins>
+      <w:r>
+        <w:rPr>
+          <w:rFonts w:ascii="Arial" w:eastAsia="Calibri" w:hAnsi="Arial" w:cs="Arial"/>
+          <w:kern w:val="0"/>
+          <w:sz w:val="21"/>
+          <w:szCs w:val="21"/>
+          <w:lang w:val="fr-FR"/>
+          <w14:ligatures w14:val="none"/>
+        </w:rPr>
+        <w:t xml:space="preserve">à ce que </w:t>
+      </w:r>
+      <w:del w:id="78" w:author="Jerry Kalonji" w:date="2026-08-10T14:03:00Z">
+        <w:r>
+          <w:rPr>
+            <w:rFonts w:ascii="Arial" w:eastAsia="Calibri" w:hAnsi="Arial" w:cs="Arial"/>
+            <w:kern w:val="0"/>
+            <w:sz w:val="21"/>
+            <w:szCs w:val="21"/>
+            <w:lang w:val="fr-FR"/>
+            <w14:ligatures w14:val="none"/>
+          </w:rPr>
+          <w:delText xml:space="preserve">la </w:delText>
+        </w:r>
+      </w:del>
+      <w:r>
+        <w:rPr>
+          <w:rFonts w:ascii="Arial" w:eastAsia="Calibri" w:hAnsi="Arial" w:cs="Arial"/>
+          <w:kern w:val="0"/>
+          <w:sz w:val="21"/>
+          <w:szCs w:val="21"/>
+          <w:lang w:val="fr-FR"/>
+          <w14:ligatures w14:val="none"/>
+        </w:rPr>
+        <w:t xml:space="preserve">WCAG se conforme pleinement à la législation en vigueur et soutienne la protection et la préservation de toutes les formes de patrimoine culturel contre les impacts négatifs de </w:t>
+      </w:r>
+      <w:del w:id="79" w:author="Jerry Kalonji" w:date="2026-08-10T14:04:00Z">
+        <w:r>
+          <w:rPr>
+            <w:rFonts w:ascii="Arial" w:eastAsia="Calibri" w:hAnsi="Arial" w:cs="Arial"/>
+            <w:kern w:val="0"/>
+            <w:sz w:val="21"/>
+            <w:szCs w:val="21"/>
+            <w:lang w:val="fr-FR"/>
+            <w14:ligatures w14:val="none"/>
+          </w:rPr>
+          <w:delText xml:space="preserve">ces </w:delText>
+        </w:r>
+      </w:del>
+      <w:ins w:id="80" w:author="Jerry Kalonji" w:date="2026-08-10T14:04:00Z">
+        <w:r>
+          <w:rPr>
+            <w:rFonts w:ascii="Arial" w:eastAsia="Calibri" w:hAnsi="Arial" w:cs="Arial"/>
+            <w:kern w:val="0"/>
+            <w:sz w:val="21"/>
+            <w:szCs w:val="21"/>
+            <w:lang w:val="fr-FR"/>
+            <w14:ligatures w14:val="none"/>
+          </w:rPr>
+          <w:t xml:space="preserve">ses </w:t>
+        </w:r>
+      </w:ins>
+      <w:r>
+        <w:rPr>
+          <w:rFonts w:ascii="Arial" w:eastAsia="Calibri" w:hAnsi="Arial" w:cs="Arial"/>
+          <w:kern w:val="0"/>
+          <w:sz w:val="21"/>
+          <w:szCs w:val="21"/>
+          <w:lang w:val="fr-FR"/>
+          <w14:ligatures w14:val="none"/>
+        </w:rPr>
+        <w:t xml:space="preserve">activités. </w:t>
       </w:r>
     </w:p>
     <w:p>
@@ -2258,7 +2529,7 @@
         </w:rPr>
         <w:t xml:space="preserve">Convention pour la protection du patrimoine mondial, culturel et naturel (UNESCO, ad</w:t>
       </w:r>
-      <w:del w:id="90004" w:author="Dr IBRAHIMA DIALLO" w:date="2026-08-17T12:00:00Z">
+      <w:del w:id="90004" w:author="Dr IBRAHIMA DIALLO" w:date="2026-08-17T13:00:00Z">
         <w:r>
           <w:rPr>
             <w:rFonts w:ascii="Arial" w:eastAsia="Calibri" w:hAnsi="Arial" w:cs="Arial"/>
@@ -2271,7 +2542,7 @@
           <w:delText xml:space="preserve">aptée en 1972)</w:delText>
         </w:r>
       </w:del>
-      <w:ins w:id="90005" w:author="Dr IBRAHIMA DIALLO" w:date="2026-08-17T12:00:00Z">
+      <w:ins w:id="90005" w:author="Dr IBRAHIMA DIALLO" w:date="2026-08-17T13:00:00Z">
         <w:r>
           <w:rPr>
             <w:rFonts w:ascii="Arial" w:eastAsia="Calibri" w:hAnsi="Arial" w:cs="Arial"/>
@@ -2449,8 +2720,221 @@
           <w:lang w:val="fr-FR"/>
           <w14:ligatures w14:val="none"/>
         </w:rPr>
-        <w:t xml:space="preserve">des sites du patrimoine culturel, un inventaire a été réalisé dans les localités de la zone d'étude où les études socio-économiques de base ont été conduites.</w:t>
-      </w:r>
+        <w:t xml:space="preserve">des sites du patrimoine culturel, </w:t>
+      </w:r>
+      <w:del w:id="102" w:author="Jerry Kalonji" w:date="2026-08-10T14:07:00Z">
+        <w:r>
+          <w:rPr>
+            <w:rFonts w:ascii="Arial" w:eastAsia="Calibri" w:hAnsi="Arial" w:cs="Arial"/>
+            <w:kern w:val="0"/>
+            <w:sz w:val="21"/>
+            <w:szCs w:val="21"/>
+            <w:lang w:val="fr-FR"/>
+            <w14:ligatures w14:val="none"/>
+          </w:rPr>
+          <w:delText xml:space="preserve">des </w:delText>
+        </w:r>
+      </w:del>
+      <w:ins w:id="103" w:author="Jerry Kalonji" w:date="2026-08-10T14:07:00Z">
+        <w:r>
+          <w:rPr>
+            <w:rFonts w:ascii="Arial" w:eastAsia="Calibri" w:hAnsi="Arial" w:cs="Arial"/>
+            <w:kern w:val="0"/>
+            <w:sz w:val="21"/>
+            <w:szCs w:val="21"/>
+            <w:lang w:val="fr-FR"/>
+            <w14:ligatures w14:val="none"/>
+          </w:rPr>
+          <w:t xml:space="preserve">un </w:t>
+        </w:r>
+      </w:ins>
+      <w:r>
+        <w:rPr>
+          <w:rFonts w:ascii="Arial" w:eastAsia="Calibri" w:hAnsi="Arial" w:cs="Arial"/>
+          <w:kern w:val="0"/>
+          <w:sz w:val="21"/>
+          <w:szCs w:val="21"/>
+          <w:lang w:val="fr-FR"/>
+          <w14:ligatures w14:val="none"/>
+        </w:rPr>
+        <w:t>inventaire</w:t>
+      </w:r>
+      <w:del w:id="104" w:author="Jerry Kalonji" w:date="2026-08-10T14:07:00Z">
+        <w:r>
+          <w:rPr>
+            <w:rFonts w:ascii="Arial" w:eastAsia="Calibri" w:hAnsi="Arial" w:cs="Arial"/>
+            <w:kern w:val="0"/>
+            <w:sz w:val="21"/>
+            <w:szCs w:val="21"/>
+            <w:lang w:val="fr-FR"/>
+            <w14:ligatures w14:val="none"/>
+          </w:rPr>
+          <w:delText>s</w:delText>
+        </w:r>
+      </w:del>
+      <w:r>
+        <w:rPr>
+          <w:rFonts w:ascii="Arial" w:eastAsia="Calibri" w:hAnsi="Arial" w:cs="Arial"/>
+          <w:kern w:val="0"/>
+          <w:sz w:val="21"/>
+          <w:szCs w:val="21"/>
+          <w:lang w:val="fr-FR"/>
+          <w14:ligatures w14:val="none"/>
+        </w:rPr>
+        <w:t xml:space="preserve"> </w:t>
+      </w:r>
+      <w:del w:id="105" w:author="Jerry Kalonji" w:date="2026-08-10T14:07:00Z">
+        <w:r>
+          <w:rPr>
+            <w:rFonts w:ascii="Arial" w:eastAsia="Calibri" w:hAnsi="Arial" w:cs="Arial"/>
+            <w:kern w:val="0"/>
+            <w:sz w:val="21"/>
+            <w:szCs w:val="21"/>
+            <w:lang w:val="fr-FR"/>
+            <w14:ligatures w14:val="none"/>
+          </w:rPr>
+          <w:delText xml:space="preserve">ont </w:delText>
+        </w:r>
+      </w:del>
+      <w:ins w:id="106" w:author="Jerry Kalonji" w:date="2026-08-10T14:07:00Z">
+        <w:r>
+          <w:rPr>
+            <w:rFonts w:ascii="Arial" w:eastAsia="Calibri" w:hAnsi="Arial" w:cs="Arial"/>
+            <w:kern w:val="0"/>
+            <w:sz w:val="21"/>
+            <w:szCs w:val="21"/>
+            <w:lang w:val="fr-FR"/>
+            <w14:ligatures w14:val="none"/>
+          </w:rPr>
+          <w:t xml:space="preserve">a </w:t>
+        </w:r>
+      </w:ins>
+      <w:r>
+        <w:rPr>
+          <w:rFonts w:ascii="Arial" w:eastAsia="Calibri" w:hAnsi="Arial" w:cs="Arial"/>
+          <w:kern w:val="0"/>
+          <w:sz w:val="21"/>
+          <w:szCs w:val="21"/>
+          <w:lang w:val="fr-FR"/>
+          <w14:ligatures w14:val="none"/>
+        </w:rPr>
+        <w:t xml:space="preserve">été </w:t>
+      </w:r>
+      <w:del w:id="107" w:author="Jerry Kalonji" w:date="2026-08-10T14:06:00Z">
+        <w:r>
+          <w:rPr>
+            <w:rFonts w:ascii="Arial" w:eastAsia="Calibri" w:hAnsi="Arial" w:cs="Arial"/>
+            <w:kern w:val="0"/>
+            <w:sz w:val="21"/>
+            <w:szCs w:val="21"/>
+            <w:lang w:val="fr-FR"/>
+            <w14:ligatures w14:val="none"/>
+          </w:rPr>
+          <w:delText xml:space="preserve">menées </w:delText>
+        </w:r>
+      </w:del>
+      <w:ins w:id="108" w:author="Jerry Kalonji" w:date="2026-08-10T14:06:00Z">
+        <w:r>
+          <w:rPr>
+            <w:rFonts w:ascii="Arial" w:eastAsia="Calibri" w:hAnsi="Arial" w:cs="Arial"/>
+            <w:kern w:val="0"/>
+            <w:sz w:val="21"/>
+            <w:szCs w:val="21"/>
+            <w:lang w:val="fr-FR"/>
+            <w14:ligatures w14:val="none"/>
+          </w:rPr>
+          <w:t xml:space="preserve">réalisé </w:t>
+        </w:r>
+      </w:ins>
+      <w:r>
+        <w:rPr>
+          <w:rFonts w:ascii="Arial" w:eastAsia="Calibri" w:hAnsi="Arial" w:cs="Arial"/>
+          <w:kern w:val="0"/>
+          <w:sz w:val="21"/>
+          <w:szCs w:val="21"/>
+          <w:lang w:val="fr-FR"/>
+          <w14:ligatures w14:val="none"/>
+        </w:rPr>
+        <w:t xml:space="preserve">dans les localités de la zone d'étude où les études socio-économiques de base ont été </w:t>
+      </w:r>
+      <w:del w:id="109" w:author="Jerry Kalonji" w:date="2026-08-10T14:07:00Z">
+        <w:r>
+          <w:rPr>
+            <w:rFonts w:ascii="Arial" w:eastAsia="Calibri" w:hAnsi="Arial" w:cs="Arial"/>
+            <w:kern w:val="0"/>
+            <w:sz w:val="21"/>
+            <w:szCs w:val="21"/>
+            <w:lang w:val="fr-FR"/>
+            <w14:ligatures w14:val="none"/>
+          </w:rPr>
+          <w:delText>réalisées</w:delText>
+        </w:r>
+        <w:r>
+          <w:rPr>
+            <w:rFonts w:ascii="Arial" w:eastAsia="Arial" w:hAnsi="Arial" w:cs="Arial"/>
+            <w:color w:val="000000"/>
+            <w:kern w:val="0"/>
+            <w:sz w:val="21"/>
+            <w:szCs w:val="21"/>
+            <w:lang w:val="fr-FR" w:eastAsia="fr-FR"/>
+            <w14:ligatures w14:val="none"/>
+          </w:rPr>
+          <w:delText xml:space="preserve"> </w:delText>
+        </w:r>
+      </w:del>
+      <w:ins w:id="110" w:author="Jerry Kalonji" w:date="2026-08-10T14:07:00Z">
+        <w:r>
+          <w:rPr>
+            <w:rFonts w:ascii="Arial" w:eastAsia="Calibri" w:hAnsi="Arial" w:cs="Arial"/>
+            <w:kern w:val="0"/>
+            <w:sz w:val="21"/>
+            <w:szCs w:val="21"/>
+            <w:lang w:val="fr-FR"/>
+            <w14:ligatures w14:val="none"/>
+          </w:rPr>
+          <w:t>conduites.</w:t>
+        </w:r>
+        <w:r>
+          <w:rPr>
+            <w:rFonts w:ascii="Arial" w:eastAsia="Arial" w:hAnsi="Arial" w:cs="Arial"/>
+            <w:color w:val="000000"/>
+            <w:kern w:val="0"/>
+            <w:sz w:val="21"/>
+            <w:szCs w:val="21"/>
+            <w:lang w:val="fr-FR" w:eastAsia="fr-FR"/>
+            <w14:ligatures w14:val="none"/>
+          </w:rPr>
+          <w:t xml:space="preserve"> </w:t>
+        </w:r>
+      </w:ins>
+      <w:del w:id="111" w:author="Jerry Kalonji" w:date="2026-08-10T14:08:00Z">
+        <w:r>
+          <w:rPr>
+            <w:rFonts w:ascii="Arial" w:eastAsia="Arial" w:hAnsi="Arial" w:cs="Arial"/>
+            <w:color w:val="000000"/>
+            <w:kern w:val="0"/>
+            <w:sz w:val="21"/>
+            <w:szCs w:val="21"/>
+            <w:lang w:val="fr-FR" w:eastAsia="fr-FR"/>
+            <w14:ligatures w14:val="none"/>
+          </w:rPr>
+          <w:delText>L'inventaire a identifié</w:delText>
+        </w:r>
+      </w:del>
+      <w:ins w:id="112" w:author="Jerry Kalonji" w:date="2026-08-10T14:08:00Z">
+        <w:r>
+          <w:rPr>
+            <w:rFonts w:ascii="Arial" w:eastAsia="Arial" w:hAnsi="Arial" w:cs="Arial"/>
+            <w:color w:val="000000"/>
+            <w:kern w:val="0"/>
+            <w:sz w:val="21"/>
+            <w:szCs w:val="21"/>
+            <w:lang w:val="fr-FR" w:eastAsia="fr-FR"/>
+            <w14:ligatures w14:val="none"/>
+          </w:rPr>
+          <w:t>Au cours de cet exercice,</w:t>
+        </w:r>
+      </w:ins>
       <w:r>
         <w:rPr>
           <w:rFonts w:ascii="Arial" w:eastAsia="Arial" w:hAnsi="Arial" w:cs="Arial"/>
@@ -2461,7 +2945,73 @@
           <w:lang w:val="fr-FR" w:eastAsia="fr-FR"/>
           <w14:ligatures w14:val="none"/>
         </w:rPr>
-        <w:t xml:space="preserve"> Au cours de cet exercice, cinq (5) sites de patrimoine culturel dans les zones d'implantation des trois composantes du Projet ont été identifiés. Deux d’entre eux se trouvent dans l'emprise directe d'une composante du Projet (Fé-ra, Taloukhouré-Daranta) ; les trois autres sont situés à une distance variable de l'emprise (50 m à 1,1 km). Le Tableau ci-dessous présente ces sites. </w:t>
+        <w:t xml:space="preserve"> cinq (5) sites de patrimoine culturel dans les zones d'implantation des trois composantes du Projet</w:t>
+      </w:r>
+      <w:ins w:id="113" w:author="Jerry Kalonji" w:date="2026-08-10T14:08:00Z">
+        <w:r>
+          <w:rPr>
+            <w:rFonts w:ascii="Arial" w:eastAsia="Arial" w:hAnsi="Arial" w:cs="Arial"/>
+            <w:color w:val="000000"/>
+            <w:kern w:val="0"/>
+            <w:sz w:val="21"/>
+            <w:szCs w:val="21"/>
+            <w:lang w:val="fr-FR" w:eastAsia="fr-FR"/>
+            <w14:ligatures w14:val="none"/>
+          </w:rPr>
+          <w:t xml:space="preserve"> ont été identifiés</w:t>
+        </w:r>
+      </w:ins>
+      <w:r>
+        <w:rPr>
+          <w:rFonts w:ascii="Arial" w:eastAsia="Arial" w:hAnsi="Arial" w:cs="Arial"/>
+          <w:color w:val="000000"/>
+          <w:kern w:val="0"/>
+          <w:sz w:val="21"/>
+          <w:szCs w:val="21"/>
+          <w:lang w:val="fr-FR" w:eastAsia="fr-FR"/>
+          <w14:ligatures w14:val="none"/>
+        </w:rPr>
+        <w:t xml:space="preserve">. Deux </w:t>
+      </w:r>
+      <w:del w:id="114" w:author="Jerry Kalonji" w:date="2026-08-10T14:08:00Z">
+        <w:r>
+          <w:rPr>
+            <w:rFonts w:ascii="Arial" w:eastAsia="Arial" w:hAnsi="Arial" w:cs="Arial"/>
+            <w:color w:val="000000"/>
+            <w:kern w:val="0"/>
+            <w:sz w:val="21"/>
+            <w:szCs w:val="21"/>
+            <w:lang w:val="fr-FR" w:eastAsia="fr-FR"/>
+            <w14:ligatures w14:val="none"/>
+          </w:rPr>
+          <w:delText>sites sur cinq</w:delText>
+        </w:r>
+      </w:del>
+      <w:ins w:id="115" w:author="Jerry Kalonji" w:date="2026-08-10T14:08:00Z">
+        <w:r>
+          <w:rPr>
+            <w:rFonts w:ascii="Arial" w:eastAsia="Arial" w:hAnsi="Arial" w:cs="Arial"/>
+            <w:color w:val="000000"/>
+            <w:kern w:val="0"/>
+            <w:sz w:val="21"/>
+            <w:szCs w:val="21"/>
+            <w:lang w:val="fr-FR" w:eastAsia="fr-FR"/>
+            <w14:ligatures w14:val="none"/>
+          </w:rPr>
+          <w:t>d’entre eux</w:t>
+        </w:r>
+      </w:ins>
+      <w:r>
+        <w:rPr>
+          <w:rFonts w:ascii="Arial" w:eastAsia="Arial" w:hAnsi="Arial" w:cs="Arial"/>
+          <w:color w:val="000000"/>
+          <w:kern w:val="0"/>
+          <w:sz w:val="21"/>
+          <w:szCs w:val="21"/>
+          <w:lang w:val="fr-FR" w:eastAsia="fr-FR"/>
+          <w14:ligatures w14:val="none"/>
+        </w:rPr>
+        <w:t xml:space="preserve"> se trouvent dans l'emprise directe d'une composante du Projet (Fé-ra, Taloukhouré-Daranta) ; les trois autres sont situés à une distance variable de l'emprise (50 m à 1,1 km). Le Tableau ci-dessous présente ces sites. </w:t>
       </w:r>
     </w:p>
     <w:p>
@@ -2482,6 +3032,7 @@
         <w:pStyle w:val="Lgende"/>
         <w:keepNext/>
         <w:rPr>
+          <w:ins w:id="116" w:author="Ismael SAMBY" w:date="2026-08-10T16:24:00Z"/>
           <w:rFonts w:ascii="Arial" w:eastAsia="Arial" w:hAnsi="Arial" w:cs="Arial"/>
           <w:i w:val="0"/>
           <w:iCs w:val="0"/>
@@ -2492,13 +3043,68 @@
           <w:lang w:val="fr-FR" w:eastAsia="fr-FR"/>
           <w14:ligatures w14:val="none"/>
           <w:rPrChange w:id="117" w:author="Ismael SAMBY" w:date="2026-08-10T16:24:00Z">
-            <w:rPr/>
+            <w:rPr>
+              <w:ins w:id="118" w:author="Ismael SAMBY" w:date="2026-08-10T16:24:00Z"/>
+            </w:rPr>
           </w:rPrChange>
         </w:rPr>
         <w:pPrChange w:id="119" w:author="Ismael SAMBY" w:date="2026-08-10T16:24:00Z">
           <w:pPr/>
         </w:pPrChange>
       </w:pPr>
+      <w:ins w:id="120" w:author="Ismael SAMBY" w:date="2026-08-10T16:24:00Z">
+        <w:r>
+          <w:rPr>
+            <w:rFonts w:ascii="Arial" w:eastAsia="Arial" w:hAnsi="Arial" w:cs="Arial"/>
+            <w:i w:val="0"/>
+            <w:iCs w:val="0"/>
+            <w:color w:val="000000"/>
+            <w:kern w:val="0"/>
+            <w:sz w:val="21"/>
+            <w:szCs w:val="21"/>
+            <w:lang w:val="fr-FR" w:eastAsia="fr-FR"/>
+            <w14:ligatures w14:val="none"/>
+            <w:rPrChange w:id="121" w:author="Ismael SAMBY" w:date="2026-08-10T16:24:00Z">
+              <w:rPr/>
+            </w:rPrChange>
+          </w:rPr>
+          <w:t xml:space="preserve">Tableau </w:t>
+        </w:r>
+        <w:r>
+          <w:rPr>
+            <w:rFonts w:ascii="Arial" w:eastAsia="Arial" w:hAnsi="Arial" w:cs="Arial"/>
+            <w:i w:val="0"/>
+            <w:iCs w:val="0"/>
+            <w:color w:val="000000"/>
+            <w:kern w:val="0"/>
+            <w:sz w:val="21"/>
+            <w:szCs w:val="21"/>
+            <w:lang w:val="fr-FR" w:eastAsia="fr-FR"/>
+            <w14:ligatures w14:val="none"/>
+            <w:rPrChange w:id="122" w:author="Ismael SAMBY" w:date="2026-08-10T16:24:00Z">
+              <w:rPr/>
+            </w:rPrChange>
+          </w:rPr>
+          <w:fldChar w:fldCharType="begin"/>
+        </w:r>
+        <w:r>
+          <w:rPr>
+            <w:rFonts w:ascii="Arial" w:eastAsia="Arial" w:hAnsi="Arial" w:cs="Arial"/>
+            <w:i w:val="0"/>
+            <w:iCs w:val="0"/>
+            <w:color w:val="000000"/>
+            <w:kern w:val="0"/>
+            <w:sz w:val="21"/>
+            <w:szCs w:val="21"/>
+            <w:lang w:val="fr-FR" w:eastAsia="fr-FR"/>
+            <w14:ligatures w14:val="none"/>
+            <w:rPrChange w:id="123" w:author="Ismael SAMBY" w:date="2026-08-10T16:24:00Z">
+              <w:rPr/>
+            </w:rPrChange>
+          </w:rPr>
+          <w:instrText xml:space="preserve"> SEQ Tableau \* ARABIC </w:instrText>
+        </w:r>
+      </w:ins>
       <w:r>
         <w:rPr>
           <w:rFonts w:ascii="Arial" w:eastAsia="Arial" w:hAnsi="Arial" w:cs="Arial"/>
@@ -2510,116 +3116,67 @@
           <w:szCs w:val="21"/>
           <w:lang w:val="fr-FR" w:eastAsia="fr-FR"/>
           <w14:ligatures w14:val="none"/>
-          <w:rPrChange w:id="121" w:author="Ismael SAMBY" w:date="2026-08-10T16:24:00Z">
-            <w:rPr/>
-          </w:rPrChange>
-        </w:rPr>
-        <w:t xml:space="preserve">Tableau </w:t>
-      </w:r>
-      <w:r>
-        <w:rPr>
-          <w:rFonts w:ascii="Arial" w:eastAsia="Arial" w:hAnsi="Arial" w:cs="Arial"/>
-          <w:i w:val="0"/>
-          <w:iCs w:val="0"/>
-          <w:color w:val="000000"/>
-          <w:kern w:val="0"/>
-          <w:sz w:val="21"/>
-          <w:szCs w:val="21"/>
-          <w:lang w:val="fr-FR" w:eastAsia="fr-FR"/>
-          <w14:ligatures w14:val="none"/>
-          <w:rPrChange w:id="122" w:author="Ismael SAMBY" w:date="2026-08-10T16:24:00Z">
-            <w:rPr/>
-          </w:rPrChange>
-        </w:rPr>
-        <w:fldChar w:fldCharType="begin"/>
-      </w:r>
-      <w:r>
-        <w:rPr>
-          <w:rFonts w:ascii="Arial" w:eastAsia="Arial" w:hAnsi="Arial" w:cs="Arial"/>
-          <w:i w:val="0"/>
-          <w:iCs w:val="0"/>
-          <w:color w:val="000000"/>
-          <w:kern w:val="0"/>
-          <w:sz w:val="21"/>
-          <w:szCs w:val="21"/>
-          <w:lang w:val="fr-FR" w:eastAsia="fr-FR"/>
-          <w14:ligatures w14:val="none"/>
-          <w:rPrChange w:id="123" w:author="Ismael SAMBY" w:date="2026-08-10T16:24:00Z">
-            <w:rPr/>
-          </w:rPrChange>
-        </w:rPr>
-        <w:instrText xml:space="preserve"> SEQ Tableau \* ARABIC </w:instrText>
-      </w:r>
-      <w:r>
-        <w:rPr>
-          <w:rFonts w:ascii="Arial" w:eastAsia="Arial" w:hAnsi="Arial" w:cs="Arial"/>
-          <w:i w:val="0"/>
-          <w:iCs w:val="0"/>
-          <w:color w:val="000000"/>
-          <w:kern w:val="0"/>
-          <w:sz w:val="21"/>
-          <w:szCs w:val="21"/>
-          <w:lang w:val="fr-FR" w:eastAsia="fr-FR"/>
-          <w14:ligatures w14:val="none"/>
           <w:rPrChange w:id="124" w:author="Ismael SAMBY" w:date="2026-08-10T16:24:00Z">
             <w:rPr/>
           </w:rPrChange>
         </w:rPr>
         <w:fldChar w:fldCharType="separate"/>
       </w:r>
-      <w:r>
-        <w:rPr>
-          <w:rFonts w:ascii="Arial" w:eastAsia="Arial" w:hAnsi="Arial" w:cs="Arial"/>
-          <w:i w:val="0"/>
-          <w:iCs w:val="0"/>
-          <w:color w:val="000000"/>
-          <w:kern w:val="0"/>
-          <w:sz w:val="21"/>
-          <w:szCs w:val="21"/>
-          <w:lang w:val="fr-FR" w:eastAsia="fr-FR"/>
-          <w14:ligatures w14:val="none"/>
-          <w:rPrChange w:id="126" w:author="Ismael SAMBY" w:date="2026-08-10T16:24:00Z">
-            <w:rPr>
-              <w:noProof/>
-            </w:rPr>
-          </w:rPrChange>
-        </w:rPr>
-        <w:t>2</w:t>
-      </w:r>
-      <w:r>
-        <w:rPr>
-          <w:rFonts w:ascii="Arial" w:eastAsia="Arial" w:hAnsi="Arial" w:cs="Arial"/>
-          <w:i w:val="0"/>
-          <w:iCs w:val="0"/>
-          <w:color w:val="000000"/>
-          <w:kern w:val="0"/>
-          <w:sz w:val="21"/>
-          <w:szCs w:val="21"/>
-          <w:lang w:val="fr-FR" w:eastAsia="fr-FR"/>
-          <w14:ligatures w14:val="none"/>
-          <w:rPrChange w:id="127" w:author="Ismael SAMBY" w:date="2026-08-10T16:24:00Z">
-            <w:rPr/>
-          </w:rPrChange>
-        </w:rPr>
-        <w:fldChar w:fldCharType="end"/>
-      </w:r>
-      <w:r>
-        <w:rPr>
-          <w:rFonts w:ascii="Arial" w:eastAsia="Arial" w:hAnsi="Arial" w:cs="Arial"/>
-          <w:i w:val="0"/>
-          <w:iCs w:val="0"/>
-          <w:color w:val="000000"/>
-          <w:kern w:val="0"/>
-          <w:sz w:val="21"/>
-          <w:szCs w:val="21"/>
-          <w:lang w:val="fr-FR" w:eastAsia="fr-FR"/>
-          <w14:ligatures w14:val="none"/>
-          <w:rPrChange w:id="128" w:author="Ismael SAMBY" w:date="2026-08-10T16:24:00Z">
-            <w:rPr/>
-          </w:rPrChange>
-        </w:rPr>
-        <w:t>: Localisation des sites patrimoniaux identifiés dans la zone du Projet</w:t>
-      </w:r>
+      <w:ins w:id="125" w:author="Ismael SAMBY" w:date="2026-08-10T16:24:00Z">
+        <w:r>
+          <w:rPr>
+            <w:rFonts w:ascii="Arial" w:eastAsia="Arial" w:hAnsi="Arial" w:cs="Arial"/>
+            <w:i w:val="0"/>
+            <w:iCs w:val="0"/>
+            <w:color w:val="000000"/>
+            <w:kern w:val="0"/>
+            <w:sz w:val="21"/>
+            <w:szCs w:val="21"/>
+            <w:lang w:val="fr-FR" w:eastAsia="fr-FR"/>
+            <w14:ligatures w14:val="none"/>
+            <w:rPrChange w:id="126" w:author="Ismael SAMBY" w:date="2026-08-10T16:24:00Z">
+              <w:rPr>
+                <w:noProof/>
+              </w:rPr>
+            </w:rPrChange>
+          </w:rPr>
+          <w:t>2</w:t>
+        </w:r>
+        <w:r>
+          <w:rPr>
+            <w:rFonts w:ascii="Arial" w:eastAsia="Arial" w:hAnsi="Arial" w:cs="Arial"/>
+            <w:i w:val="0"/>
+            <w:iCs w:val="0"/>
+            <w:color w:val="000000"/>
+            <w:kern w:val="0"/>
+            <w:sz w:val="21"/>
+            <w:szCs w:val="21"/>
+            <w:lang w:val="fr-FR" w:eastAsia="fr-FR"/>
+            <w14:ligatures w14:val="none"/>
+            <w:rPrChange w:id="127" w:author="Ismael SAMBY" w:date="2026-08-10T16:24:00Z">
+              <w:rPr/>
+            </w:rPrChange>
+          </w:rPr>
+          <w:fldChar w:fldCharType="end"/>
+        </w:r>
+        <w:r>
+          <w:rPr>
+            <w:rFonts w:ascii="Arial" w:eastAsia="Arial" w:hAnsi="Arial" w:cs="Arial"/>
+            <w:i w:val="0"/>
+            <w:iCs w:val="0"/>
+            <w:color w:val="000000"/>
+            <w:kern w:val="0"/>
+            <w:sz w:val="21"/>
+            <w:szCs w:val="21"/>
+            <w:lang w:val="fr-FR" w:eastAsia="fr-FR"/>
+            <w14:ligatures w14:val="none"/>
+            <w:rPrChange w:id="128" w:author="Ismael SAMBY" w:date="2026-08-10T16:24:00Z">
+              <w:rPr/>
+            </w:rPrChange>
+          </w:rPr>
+          <w:t>: Localisation des sites patrimoniaux identifiés dans la zone du Projet</w:t>
+        </w:r>
+      </w:ins>
     </w:p>
     <w:tbl>
       <w:tblPr>
@@ -3949,7 +4506,68 @@
           <w:lang w:val="fr-FR"/>
           <w14:ligatures w14:val="none"/>
         </w:rPr>
-        <w:t xml:space="preserve">La méthode de documentation des sites du patrimoine culturel appliquée au cours de cette étude a consisté à rencontrer les communautés des villages potentiellement impactés par le projet. Il leur a été demandé de divulguer volontairement leur connaissance de tout site sacré situé à proximité ou en dehors de la zone d’étude. Les personnes interrogées ont été invitées à identifier les sites qui pourraient être potentiellement impactés - directement ou indirectement - par les activités du Projet. </w:t>
+        <w:t xml:space="preserve">La méthode de documentation des sites du patrimoine culturel appliquée au cours de cette étude a consisté à rencontrer les communautés des villages potentiellement impactés par le projet. </w:t>
+      </w:r>
+      <w:del w:id="148" w:author="Jerry Kalonji" w:date="2026-08-10T14:09:00Z">
+        <w:r>
+          <w:rPr>
+            <w:rFonts w:ascii="Arial" w:eastAsia="Calibri" w:hAnsi="Arial" w:cs="Arial"/>
+            <w:kern w:val="0"/>
+            <w:sz w:val="21"/>
+            <w:szCs w:val="21"/>
+            <w:lang w:val="fr-FR"/>
+            <w14:ligatures w14:val="none"/>
+          </w:rPr>
+          <w:delText xml:space="preserve">On </w:delText>
+        </w:r>
+      </w:del>
+      <w:ins w:id="149" w:author="Jerry Kalonji" w:date="2026-08-10T14:09:00Z">
+        <w:r>
+          <w:rPr>
+            <w:rFonts w:ascii="Arial" w:eastAsia="Calibri" w:hAnsi="Arial" w:cs="Arial"/>
+            <w:kern w:val="0"/>
+            <w:sz w:val="21"/>
+            <w:szCs w:val="21"/>
+            <w:lang w:val="fr-FR"/>
+            <w14:ligatures w14:val="none"/>
+          </w:rPr>
+          <w:t xml:space="preserve">Il </w:t>
+        </w:r>
+      </w:ins>
+      <w:r>
+        <w:rPr>
+          <w:rFonts w:ascii="Arial" w:eastAsia="Calibri" w:hAnsi="Arial" w:cs="Arial"/>
+          <w:kern w:val="0"/>
+          <w:sz w:val="21"/>
+          <w:szCs w:val="21"/>
+          <w:lang w:val="fr-FR"/>
+          <w14:ligatures w14:val="none"/>
+        </w:rPr>
+        <w:t xml:space="preserve">leur a </w:t>
+      </w:r>
+      <w:ins w:id="150" w:author="Jerry Kalonji" w:date="2026-08-10T14:09:00Z">
+        <w:r>
+          <w:rPr>
+            <w:rFonts w:ascii="Arial" w:eastAsia="Calibri" w:hAnsi="Arial" w:cs="Arial"/>
+            <w:kern w:val="0"/>
+            <w:sz w:val="21"/>
+            <w:szCs w:val="21"/>
+            <w:lang w:val="fr-FR"/>
+            <w14:ligatures w14:val="none"/>
+          </w:rPr>
+          <w:t xml:space="preserve">été </w:t>
+        </w:r>
+      </w:ins>
+      <w:r>
+        <w:rPr>
+          <w:rFonts w:ascii="Arial" w:eastAsia="Calibri" w:hAnsi="Arial" w:cs="Arial"/>
+          <w:kern w:val="0"/>
+          <w:sz w:val="21"/>
+          <w:szCs w:val="21"/>
+          <w:lang w:val="fr-FR"/>
+          <w14:ligatures w14:val="none"/>
+        </w:rPr>
+        <w:t xml:space="preserve">demandé de divulguer volontairement leur connaissance de tout site sacré situé à proximité ou en dehors de la zone d’étude. Les personnes interrogées ont été invitées à identifier les sites qui pourraient être potentiellement impactés - directement ou indirectement - par les activités du Projet. </w:t>
       </w:r>
     </w:p>
     <w:p>
@@ -4438,7 +5056,42 @@
           <w:lang w:val="fr-FR"/>
           <w14:ligatures w14:val="none"/>
         </w:rPr>
-        <w:t xml:space="preserve">Patrimoine culturel immatériel</w:t>
+        <w:t xml:space="preserve">Patrimoine culturel </w:t>
+      </w:r>
+      <w:commentRangeStart w:id="156"/>
+      <w:commentRangeStart w:id="157"/>
+      <w:r>
+        <w:rPr>
+          <w:rFonts w:ascii="Arial" w:eastAsia="Calibri" w:hAnsi="Arial" w:cs="Arial"/>
+          <w:kern w:val="0"/>
+          <w:sz w:val="21"/>
+          <w:szCs w:val="21"/>
+          <w:u w:val="single"/>
+          <w:lang w:val="fr-FR"/>
+          <w14:ligatures w14:val="none"/>
+        </w:rPr>
+        <w:t>immatériel</w:t>
+      </w:r>
+      <w:commentRangeEnd w:id="156"/>
+      <w:r>
+        <w:rPr>
+          <w:rStyle w:val="Marquedecommentaire"/>
+          <w:rFonts w:ascii="Arial" w:eastAsia="Calibri" w:hAnsi="Arial" w:cs="Arial"/>
+          <w:kern w:val="0"/>
+          <w:sz w:val="21"/>
+          <w:szCs w:val="21"/>
+          <w:u w:val="single"/>
+          <w:lang w:val="fr-FR"/>
+          <w14:ligatures w14:val="none"/>
+        </w:rPr>
+        <w:commentReference w:id="156"/>
+      </w:r>
+      <w:commentRangeEnd w:id="157"/>
+      <w:r>
+        <w:rPr>
+          <w:rStyle w:val="Marquedecommentaire"/>
+        </w:rPr>
+        <w:commentReference w:id="157"/>
       </w:r>
     </w:p>
     <w:p>
@@ -4466,6 +5119,7 @@
         <w:spacing w:after="0" w:line="276" w:lineRule="auto"/>
         <w:jc w:val="both"/>
         <w:rPr>
+          <w:ins w:id="158" w:author="Ismael SAMBY" w:date="2026-08-10T16:35:00Z"/>
           <w:rFonts w:ascii="Arial" w:eastAsia="Calibri" w:hAnsi="Arial" w:cs="Arial"/>
           <w:kern w:val="0"/>
           <w:sz w:val="21"/>
@@ -4474,6 +5128,7 @@
           <w14:ligatures w14:val="none"/>
           <w:rPrChange w:id="159" w:author="Ismael SAMBY" w:date="2026-08-10T16:37:00Z">
             <w:rPr>
+              <w:ins w:id="160" w:author="Ismael SAMBY" w:date="2026-08-10T16:35:00Z"/>
               <w:rFonts w:ascii="Times New Roman" w:eastAsia="Times New Roman" w:hAnsi="Times New Roman" w:cs="Times New Roman"/>
               <w:kern w:val="0"/>
               <w:sz w:val="24"/>
@@ -4489,66 +5144,70 @@
           </w:pPr>
         </w:pPrChange>
       </w:pPr>
-      <w:r>
-        <w:rPr>
-          <w:rFonts w:ascii="Arial" w:eastAsia="Calibri" w:hAnsi="Arial" w:cs="Arial"/>
-          <w:kern w:val="0"/>
-          <w:sz w:val="21"/>
-          <w:szCs w:val="21"/>
-          <w:lang w:val="fr-FR"/>
-          <w14:ligatures w14:val="none"/>
-          <w:rPrChange w:id="163" w:author="Ismael SAMBY" w:date="2026-08-10T16:37:00Z">
-            <w:rPr>
-              <w:rFonts w:ascii="Times New Roman" w:eastAsia="Times New Roman" w:hAnsi="Times New Roman" w:cs="Times New Roman"/>
-              <w:b/>
-              <w:bCs/>
-              <w:kern w:val="0"/>
-              <w:sz w:val="24"/>
-              <w:szCs w:val="24"/>
-              <w:lang w:val="fr-FR" w:eastAsia="fr-FR"/>
-              <w14:ligatures w14:val="none"/>
-            </w:rPr>
-          </w:rPrChange>
-        </w:rPr>
-        <w:t>Les savoirs relatifs à la médecine traditionnelle</w:t>
-      </w:r>
-      <w:r>
-        <w:rPr>
-          <w:rFonts w:ascii="Arial" w:eastAsia="Calibri" w:hAnsi="Arial" w:cs="Arial"/>
-          <w:kern w:val="0"/>
-          <w:sz w:val="21"/>
-          <w:szCs w:val="21"/>
-          <w:lang w:val="fr-FR"/>
-          <w14:ligatures w14:val="none"/>
-          <w:rPrChange w:id="164" w:author="Ismael SAMBY" w:date="2026-08-10T16:37:00Z">
-            <w:rPr>
-              <w:rFonts w:ascii="Times New Roman" w:eastAsia="Times New Roman" w:hAnsi="Times New Roman" w:cs="Times New Roman"/>
-              <w:kern w:val="0"/>
-              <w:sz w:val="24"/>
-              <w:szCs w:val="24"/>
-              <w:lang w:val="fr-FR" w:eastAsia="fr-FR"/>
-              <w14:ligatures w14:val="none"/>
-            </w:rPr>
-          </w:rPrChange>
-        </w:rPr>
-        <w:t xml:space="preserve">, fondés sur la connaissance et l'usage de plantes locales issues des forêts-galeries et des mangroves de la zone d'étude, dont la disponibilité pourrait être affectée par la perte de couvert végétal associée au Projet ; </w:t>
-      </w:r>
-      <w:r>
-        <w:rPr>
-          <w:rFonts w:ascii="Arial" w:eastAsia="Calibri" w:hAnsi="Arial" w:cs="Arial"/>
-          <w:kern w:val="0"/>
-          <w:sz w:val="21"/>
-          <w:szCs w:val="21"/>
-          <w:lang w:val="fr-FR"/>
-          <w14:ligatures w14:val="none"/>
-          <w:rPrChange w:id="166" w:author="Ismael SAMBY" w:date="2026-08-10T16:37:00Z">
-            <w:rPr>
-              <w:lang w:val="fr-FR"/>
-            </w:rPr>
-          </w:rPrChange>
-        </w:rPr>
-        <w:t>et</w:t>
-      </w:r>
+      <w:ins w:id="162" w:author="Ismael SAMBY" w:date="2026-08-10T16:35:00Z">
+        <w:r>
+          <w:rPr>
+            <w:rFonts w:ascii="Arial" w:eastAsia="Calibri" w:hAnsi="Arial" w:cs="Arial"/>
+            <w:kern w:val="0"/>
+            <w:sz w:val="21"/>
+            <w:szCs w:val="21"/>
+            <w:lang w:val="fr-FR"/>
+            <w14:ligatures w14:val="none"/>
+            <w:rPrChange w:id="163" w:author="Ismael SAMBY" w:date="2026-08-10T16:37:00Z">
+              <w:rPr>
+                <w:rFonts w:ascii="Times New Roman" w:eastAsia="Times New Roman" w:hAnsi="Times New Roman" w:cs="Times New Roman"/>
+                <w:b/>
+                <w:bCs/>
+                <w:kern w:val="0"/>
+                <w:sz w:val="24"/>
+                <w:szCs w:val="24"/>
+                <w:lang w:val="fr-FR" w:eastAsia="fr-FR"/>
+                <w14:ligatures w14:val="none"/>
+              </w:rPr>
+            </w:rPrChange>
+          </w:rPr>
+          <w:t>Les savoirs relatifs à la médecine traditionnelle</w:t>
+        </w:r>
+        <w:r>
+          <w:rPr>
+            <w:rFonts w:ascii="Arial" w:eastAsia="Calibri" w:hAnsi="Arial" w:cs="Arial"/>
+            <w:kern w:val="0"/>
+            <w:sz w:val="21"/>
+            <w:szCs w:val="21"/>
+            <w:lang w:val="fr-FR"/>
+            <w14:ligatures w14:val="none"/>
+            <w:rPrChange w:id="164" w:author="Ismael SAMBY" w:date="2026-08-10T16:37:00Z">
+              <w:rPr>
+                <w:rFonts w:ascii="Times New Roman" w:eastAsia="Times New Roman" w:hAnsi="Times New Roman" w:cs="Times New Roman"/>
+                <w:kern w:val="0"/>
+                <w:sz w:val="24"/>
+                <w:szCs w:val="24"/>
+                <w:lang w:val="fr-FR" w:eastAsia="fr-FR"/>
+                <w14:ligatures w14:val="none"/>
+              </w:rPr>
+            </w:rPrChange>
+          </w:rPr>
+          <w:t xml:space="preserve">, fondés sur la connaissance et l'usage de plantes locales issues des forêts-galeries et des mangroves de la zone d'étude, dont la disponibilité pourrait être affectée par la perte de couvert végétal associée au Projet ; </w:t>
+        </w:r>
+      </w:ins>
+      <w:ins w:id="165" w:author="Ismael SAMBY" w:date="2026-08-10T16:36:00Z">
+        <w:r>
+          <w:rPr>
+            <w:rFonts w:ascii="Arial" w:eastAsia="Calibri" w:hAnsi="Arial" w:cs="Arial"/>
+            <w:kern w:val="0"/>
+            <w:sz w:val="21"/>
+            <w:szCs w:val="21"/>
+            <w:lang w:val="fr-FR"/>
+            <w14:ligatures w14:val="none"/>
+            <w:rPrChange w:id="166" w:author="Ismael SAMBY" w:date="2026-08-10T16:37:00Z">
+              <w:rPr>
+                <w:lang w:val="fr-FR"/>
+              </w:rPr>
+            </w:rPrChange>
+          </w:rPr>
+          <w:t>et</w:t>
+        </w:r>
+      </w:ins>
     </w:p>
     <w:p>
       <w:pPr>
@@ -4560,6 +5219,7 @@
         <w:spacing w:after="0" w:line="276" w:lineRule="auto"/>
         <w:jc w:val="both"/>
         <w:rPr>
+          <w:ins w:id="167" w:author="Ismael SAMBY" w:date="2026-08-10T16:35:00Z"/>
           <w:rFonts w:ascii="Arial" w:eastAsia="Calibri" w:hAnsi="Arial" w:cs="Arial"/>
           <w:kern w:val="0"/>
           <w:sz w:val="21"/>
@@ -4568,6 +5228,7 @@
           <w14:ligatures w14:val="none"/>
           <w:rPrChange w:id="168" w:author="Ismael SAMBY" w:date="2026-08-10T16:37:00Z">
             <w:rPr>
+              <w:ins w:id="169" w:author="Ismael SAMBY" w:date="2026-08-10T16:35:00Z"/>
               <w:lang w:val="fr-FR"/>
             </w:rPr>
           </w:rPrChange>
@@ -4579,98 +5240,176 @@
           </w:pPr>
         </w:pPrChange>
       </w:pPr>
-      <w:r>
-        <w:rPr>
-          <w:rFonts w:ascii="Arial" w:eastAsia="Calibri" w:hAnsi="Arial" w:cs="Arial"/>
-          <w:kern w:val="0"/>
-          <w:sz w:val="21"/>
-          <w:szCs w:val="21"/>
-          <w:lang w:val="fr-FR"/>
-          <w14:ligatures w14:val="none"/>
-          <w:rPrChange w:id="172" w:author="Ismael SAMBY" w:date="2026-08-10T16:37:00Z">
+      <w:ins w:id="171" w:author="Ismael SAMBY" w:date="2026-08-10T16:35:00Z">
+        <w:r>
+          <w:rPr>
+            <w:rFonts w:ascii="Arial" w:eastAsia="Calibri" w:hAnsi="Arial" w:cs="Arial"/>
+            <w:kern w:val="0"/>
+            <w:sz w:val="21"/>
+            <w:szCs w:val="21"/>
+            <w:lang w:val="fr-FR"/>
+            <w14:ligatures w14:val="none"/>
+            <w:rPrChange w:id="172" w:author="Ismael SAMBY" w:date="2026-08-10T16:37:00Z">
+              <w:rPr>
+                <w:rFonts w:ascii="Times New Roman" w:eastAsia="Times New Roman" w:hAnsi="Times New Roman" w:cs="Times New Roman"/>
+                <w:b/>
+                <w:bCs/>
+                <w:kern w:val="0"/>
+                <w:sz w:val="24"/>
+                <w:szCs w:val="24"/>
+                <w:lang w:val="fr-FR" w:eastAsia="fr-FR"/>
+                <w14:ligatures w14:val="none"/>
+              </w:rPr>
+            </w:rPrChange>
+          </w:rPr>
+          <w:t>Les pratiques rituelles et croyances associées aux sites sacrés</w:t>
+        </w:r>
+        <w:r>
+          <w:rPr>
+            <w:rFonts w:ascii="Arial" w:eastAsia="Calibri" w:hAnsi="Arial" w:cs="Arial"/>
+            <w:kern w:val="0"/>
+            <w:sz w:val="21"/>
+            <w:szCs w:val="21"/>
+            <w:lang w:val="fr-FR"/>
+            <w14:ligatures w14:val="none"/>
+            <w:rPrChange w:id="173" w:author="Ismael SAMBY" w:date="2026-08-10T16:37:00Z">
+              <w:rPr>
+                <w:rFonts w:ascii="Times New Roman" w:eastAsia="Times New Roman" w:hAnsi="Times New Roman" w:cs="Times New Roman"/>
+                <w:kern w:val="0"/>
+                <w:sz w:val="24"/>
+                <w:szCs w:val="24"/>
+                <w:lang w:val="fr-FR" w:eastAsia="fr-FR"/>
+                <w14:ligatures w14:val="none"/>
+              </w:rPr>
+            </w:rPrChange>
+          </w:rPr>
+          <w:t xml:space="preserve"> identifiés dans la zone d'influence du Projet, dont le détail (localisation, communautés détentrices, mesures de gestion) est présenté au Chapitre </w:t>
+        </w:r>
+      </w:ins>
+      <w:ins w:id="174" w:author="Ismael SAMBY" w:date="2026-08-10T16:37:00Z">
+        <w:r>
+          <w:rPr>
+            <w:rFonts w:ascii="Arial" w:eastAsia="Calibri" w:hAnsi="Arial" w:cs="Arial"/>
+            <w:kern w:val="0"/>
+            <w:sz w:val="21"/>
+            <w:szCs w:val="21"/>
+            <w:lang w:val="fr-FR"/>
+            <w14:ligatures w14:val="none"/>
+            <w:rPrChange w:id="175" w:author="Ismael SAMBY" w:date="2026-08-10T16:37:00Z">
+              <w:rPr>
+                <w:lang w:val="fr-FR"/>
+              </w:rPr>
+            </w:rPrChange>
+          </w:rPr>
+          <w:t>(</w:t>
+        </w:r>
+      </w:ins>
+      <w:ins w:id="176" w:author="Ismael SAMBY" w:date="2026-08-10T16:36:00Z">
+        <w:r>
+          <w:rPr>
+            <w:rFonts w:ascii="Arial" w:eastAsia="Calibri" w:hAnsi="Arial" w:cs="Arial"/>
+            <w:kern w:val="0"/>
+            <w:sz w:val="21"/>
+            <w:szCs w:val="21"/>
+            <w:lang w:val="fr-FR"/>
+            <w14:ligatures w14:val="none"/>
+            <w:rPrChange w:id="177" w:author="Ismael SAMBY" w:date="2026-08-10T16:37:00Z">
+              <w:rPr>
+                <w:lang w:val="fr-FR"/>
+              </w:rPr>
+            </w:rPrChange>
+          </w:rPr>
+          <w:t>8.3</w:t>
+        </w:r>
+      </w:ins>
+      <w:ins w:id="178" w:author="Ismael SAMBY" w:date="2026-08-10T16:37:00Z">
+        <w:r>
+          <w:rPr>
+            <w:rFonts w:ascii="Arial" w:eastAsia="Calibri" w:hAnsi="Arial" w:cs="Arial"/>
+            <w:kern w:val="0"/>
+            <w:sz w:val="21"/>
+            <w:szCs w:val="21"/>
+            <w:lang w:val="fr-FR"/>
+            <w14:ligatures w14:val="none"/>
+            <w:rPrChange w:id="179" w:author="Ismael SAMBY" w:date="2026-08-10T16:37:00Z">
+              <w:rPr>
+                <w:lang w:val="fr-FR"/>
+              </w:rPr>
+            </w:rPrChange>
+          </w:rPr>
+          <w:t>).</w:t>
+        </w:r>
+      </w:ins>
+    </w:p>
+    <w:p>
+      <w:pPr>
+        <w:spacing w:after="0" w:line="276" w:lineRule="auto"/>
+        <w:jc w:val="both"/>
+        <w:rPr>
+          <w:del w:id="180" w:author="Ismael SAMBY" w:date="2026-08-10T16:35:00Z"/>
+          <w:rFonts w:ascii="Arial" w:eastAsia="Calibri" w:hAnsi="Arial" w:cs="Arial"/>
+          <w:kern w:val="0"/>
+          <w:sz w:val="21"/>
+          <w:szCs w:val="21"/>
+          <w:lang w:val="fr-FR" w:eastAsia="fr-FR"/>
+          <w14:ligatures w14:val="none"/>
+        </w:rPr>
+      </w:pPr>
+      <w:commentRangeStart w:id="181"/>
+      <w:del w:id="182" w:author="Ismael SAMBY" w:date="2026-08-10T16:35:00Z">
+        <w:r>
+          <w:rPr>
+            <w:rFonts w:ascii="Arial" w:eastAsia="Calibri" w:hAnsi="Arial" w:cs="Arial"/>
+            <w:kern w:val="0"/>
+            <w:sz w:val="21"/>
+            <w:szCs w:val="21"/>
+            <w:lang w:val="fr-FR" w:eastAsia="fr-FR"/>
+            <w14:ligatures w14:val="none"/>
+          </w:rPr>
+          <w:delText>Plusieurs biens du patrimoine culturel ont été identifiés dans la zone d’étude comme faisant partie du patrimoine culturel immatériel. Parmi les sites divulgués, en dehors du patrimoine culturel matériel, il y’</w:delText>
+        </w:r>
+      </w:del>
+      <w:ins w:id="183" w:author="Jerry Kalonji" w:date="2026-08-10T14:11:00Z">
+        <w:del w:id="184" w:author="Ismael SAMBY" w:date="2026-08-10T16:35:00Z">
+          <w:r>
             <w:rPr>
-              <w:rFonts w:ascii="Times New Roman" w:eastAsia="Times New Roman" w:hAnsi="Times New Roman" w:cs="Times New Roman"/>
-              <w:b/>
-              <w:bCs/>
+              <w:rFonts w:ascii="Arial" w:eastAsia="Calibri" w:hAnsi="Arial" w:cs="Arial"/>
               <w:kern w:val="0"/>
-              <w:sz w:val="24"/>
-              <w:szCs w:val="24"/>
+              <w:sz w:val="21"/>
+              <w:szCs w:val="21"/>
               <w:lang w:val="fr-FR" w:eastAsia="fr-FR"/>
               <w14:ligatures w14:val="none"/>
             </w:rPr>
-          </w:rPrChange>
-        </w:rPr>
-        <w:t>Les pratiques rituelles et croyances associées aux sites sacrés</w:t>
-      </w:r>
-      <w:r>
-        <w:rPr>
-          <w:rFonts w:ascii="Arial" w:eastAsia="Calibri" w:hAnsi="Arial" w:cs="Arial"/>
-          <w:kern w:val="0"/>
-          <w:sz w:val="21"/>
-          <w:szCs w:val="21"/>
-          <w:lang w:val="fr-FR"/>
-          <w14:ligatures w14:val="none"/>
-          <w:rPrChange w:id="173" w:author="Ismael SAMBY" w:date="2026-08-10T16:37:00Z">
-            <w:rPr>
-              <w:rFonts w:ascii="Times New Roman" w:eastAsia="Times New Roman" w:hAnsi="Times New Roman" w:cs="Times New Roman"/>
-              <w:kern w:val="0"/>
-              <w:sz w:val="24"/>
-              <w:szCs w:val="24"/>
-              <w:lang w:val="fr-FR" w:eastAsia="fr-FR"/>
-              <w14:ligatures w14:val="none"/>
-            </w:rPr>
-          </w:rPrChange>
-        </w:rPr>
-        <w:t xml:space="preserve"> identifiés dans la zone d'influence du Projet, dont le détail (localisation, communautés détentrices, mesures de gestion) est présenté au Chapitre </w:t>
-      </w:r>
-      <w:r>
-        <w:rPr>
-          <w:rFonts w:ascii="Arial" w:eastAsia="Calibri" w:hAnsi="Arial" w:cs="Arial"/>
-          <w:kern w:val="0"/>
-          <w:sz w:val="21"/>
-          <w:szCs w:val="21"/>
-          <w:lang w:val="fr-FR"/>
-          <w14:ligatures w14:val="none"/>
-          <w:rPrChange w:id="175" w:author="Ismael SAMBY" w:date="2026-08-10T16:37:00Z">
-            <w:rPr>
-              <w:lang w:val="fr-FR"/>
-            </w:rPr>
-          </w:rPrChange>
-        </w:rPr>
-        <w:t>(</w:t>
-      </w:r>
-      <w:r>
-        <w:rPr>
-          <w:rFonts w:ascii="Arial" w:eastAsia="Calibri" w:hAnsi="Arial" w:cs="Arial"/>
-          <w:kern w:val="0"/>
-          <w:sz w:val="21"/>
-          <w:szCs w:val="21"/>
-          <w:lang w:val="fr-FR"/>
-          <w14:ligatures w14:val="none"/>
-          <w:rPrChange w:id="177" w:author="Ismael SAMBY" w:date="2026-08-10T16:37:00Z">
-            <w:rPr>
-              <w:lang w:val="fr-FR"/>
-            </w:rPr>
-          </w:rPrChange>
-        </w:rPr>
-        <w:t>8.3</w:t>
-      </w:r>
-      <w:r>
-        <w:rPr>
-          <w:rFonts w:ascii="Arial" w:eastAsia="Calibri" w:hAnsi="Arial" w:cs="Arial"/>
-          <w:kern w:val="0"/>
-          <w:sz w:val="21"/>
-          <w:szCs w:val="21"/>
-          <w:lang w:val="fr-FR"/>
-          <w14:ligatures w14:val="none"/>
-          <w:rPrChange w:id="179" w:author="Ismael SAMBY" w:date="2026-08-10T16:37:00Z">
-            <w:rPr>
-              <w:lang w:val="fr-FR"/>
-            </w:rPr>
-          </w:rPrChange>
-        </w:rPr>
-        <w:t>).</w:t>
-      </w:r>
+            <w:delText xml:space="preserve"> </w:delText>
+          </w:r>
+        </w:del>
+      </w:ins>
+      <w:del w:id="185" w:author="Ismael SAMBY" w:date="2026-08-10T16:35:00Z">
+        <w:r>
+          <w:rPr>
+            <w:rFonts w:ascii="Arial" w:eastAsia="Calibri" w:hAnsi="Arial" w:cs="Arial"/>
+            <w:kern w:val="0"/>
+            <w:sz w:val="21"/>
+            <w:szCs w:val="21"/>
+            <w:lang w:val="fr-FR" w:eastAsia="fr-FR"/>
+            <w14:ligatures w14:val="none"/>
+          </w:rPr>
+          <w:delText>a des mosquées dans chaque village.</w:delText>
+        </w:r>
+        <w:commentRangeEnd w:id="181"/>
+        <w:r>
+          <w:rPr>
+            <w:rStyle w:val="Marquedecommentaire"/>
+            <w:rFonts w:ascii="Arial" w:eastAsia="Calibri" w:hAnsi="Arial" w:cs="Arial"/>
+            <w:kern w:val="0"/>
+            <w:sz w:val="21"/>
+            <w:szCs w:val="21"/>
+            <w:lang w:val="fr-FR" w:eastAsia="fr-FR"/>
+            <w14:ligatures w14:val="none"/>
+          </w:rPr>
+          <w:commentReference w:id="181"/>
+        </w:r>
+      </w:del>
     </w:p>
     <w:p>
       <w:pPr>
@@ -4751,46 +5490,244 @@
           <w:lang w:val="fr-FR" w:eastAsia="fr-FR"/>
           <w14:ligatures w14:val="none"/>
         </w:rPr>
-        <w:t xml:space="preserve">Le patrimoine culturel matériel désigne les objets, monuments, groupes de bâtiments et de sites, ainsi que les musées qui se distinguent par leurs diverses valeurs, notamment leur signification symbolique, historique, artistique, esthétique, ethnologique ou anthropologique, scientifique et sociale. Parmi les sites divulgués, en dehors du patrimoine culturel matériel, il y a des mosquées dans chaque village</w:t>
-      </w:r>
-    </w:p>
-    <w:p>
-      <w:pPr>
-        <w:spacing w:after="0" w:line="276" w:lineRule="auto"/>
-        <w:jc w:val="both"/>
-        <w:rPr>
-          <w:rFonts w:ascii="Arial" w:eastAsia="Calibri" w:hAnsi="Arial" w:cs="Arial"/>
-          <w:kern w:val="0"/>
-          <w:sz w:val="21"/>
-          <w:szCs w:val="21"/>
-          <w:lang w:val="fr-FR"/>
-          <w14:ligatures w14:val="none"/>
-        </w:rPr>
-      </w:pPr>
-    </w:p>
-    <w:p>
-      <w:pPr>
-        <w:spacing w:after="0" w:line="276" w:lineRule="auto"/>
-        <w:jc w:val="both"/>
-        <w:rPr>
-          <w:rFonts w:ascii="Arial" w:eastAsia="Calibri" w:hAnsi="Arial" w:cs="Arial"/>
-          <w:kern w:val="0"/>
-          <w:sz w:val="21"/>
-          <w:szCs w:val="21"/>
-          <w:lang w:val="fr-FR"/>
-          <w14:ligatures w14:val="none"/>
-        </w:rPr>
-      </w:pPr>
-      <w:r>
-        <w:rPr>
-          <w:rFonts w:ascii="Arial" w:eastAsia="Calibri" w:hAnsi="Arial" w:cs="Arial"/>
-          <w:kern w:val="0"/>
-          <w:sz w:val="21"/>
-          <w:szCs w:val="21"/>
-          <w:lang w:val="fr-FR"/>
-          <w14:ligatures w14:val="none"/>
-        </w:rPr>
-        <w:t xml:space="preserve">Dans la zone d’étude, cinq sites relevant du patrimoine culturel matériel ont été recensés comme présenté ci-dessous :</w:t>
+        <w:t>Le patrimoine culturel matériel désigne les objets, monuments, groupes de bâtiments et de sites, ainsi que les musées qui se distinguent par leurs diverses valeurs, notamment leur signification symbolique, historique, artistique, esthétique, ethnologique ou anthropologique, scientifique et sociale.</w:t>
+      </w:r>
+      <w:ins w:id="186" w:author="Ismael SAMBY" w:date="2026-08-10T16:35:00Z">
+        <w:r>
+          <w:rPr>
+            <w:rFonts w:ascii="Arial" w:eastAsia="Calibri" w:hAnsi="Arial" w:cs="Arial"/>
+            <w:kern w:val="0"/>
+            <w:sz w:val="21"/>
+            <w:szCs w:val="21"/>
+            <w:lang w:val="fr-FR" w:eastAsia="fr-FR"/>
+            <w14:ligatures w14:val="none"/>
+          </w:rPr>
+          <w:t xml:space="preserve"> Parmi les sites divulgués, en dehors du patrimoine culturel matériel, il y a des mosquées dans chaque village</w:t>
+        </w:r>
+      </w:ins>
+    </w:p>
+    <w:p>
+      <w:pPr>
+        <w:spacing w:after="0" w:line="276" w:lineRule="auto"/>
+        <w:jc w:val="both"/>
+        <w:rPr>
+          <w:rFonts w:ascii="Arial" w:eastAsia="Calibri" w:hAnsi="Arial" w:cs="Arial"/>
+          <w:kern w:val="0"/>
+          <w:sz w:val="21"/>
+          <w:szCs w:val="21"/>
+          <w:lang w:val="fr-FR"/>
+          <w14:ligatures w14:val="none"/>
+        </w:rPr>
+      </w:pPr>
+    </w:p>
+    <w:p>
+      <w:pPr>
+        <w:spacing w:after="0" w:line="276" w:lineRule="auto"/>
+        <w:jc w:val="both"/>
+        <w:rPr>
+          <w:rFonts w:ascii="Arial" w:eastAsia="Calibri" w:hAnsi="Arial" w:cs="Arial"/>
+          <w:kern w:val="0"/>
+          <w:sz w:val="21"/>
+          <w:szCs w:val="21"/>
+          <w:lang w:val="fr-FR"/>
+          <w14:ligatures w14:val="none"/>
+        </w:rPr>
+      </w:pPr>
+      <w:r>
+        <w:rPr>
+          <w:rFonts w:ascii="Arial" w:eastAsia="Calibri" w:hAnsi="Arial" w:cs="Arial"/>
+          <w:kern w:val="0"/>
+          <w:sz w:val="21"/>
+          <w:szCs w:val="21"/>
+          <w:lang w:val="fr-FR"/>
+          <w14:ligatures w14:val="none"/>
+        </w:rPr>
+        <w:t xml:space="preserve">Dans la zone d’étude, </w:t>
+      </w:r>
+      <w:del w:id="187" w:author="Jerry Kalonji" w:date="2026-08-10T14:18:00Z">
+        <w:r>
+          <w:rPr>
+            <w:rFonts w:ascii="Arial" w:eastAsia="Calibri" w:hAnsi="Arial" w:cs="Arial"/>
+            <w:kern w:val="0"/>
+            <w:sz w:val="21"/>
+            <w:szCs w:val="21"/>
+            <w:lang w:val="fr-FR"/>
+            <w14:ligatures w14:val="none"/>
+          </w:rPr>
+          <w:delText xml:space="preserve">un total de </w:delText>
+        </w:r>
+      </w:del>
+      <w:r>
+        <w:rPr>
+          <w:rFonts w:ascii="Arial" w:eastAsia="Calibri" w:hAnsi="Arial" w:cs="Arial"/>
+          <w:kern w:val="0"/>
+          <w:sz w:val="21"/>
+          <w:szCs w:val="21"/>
+          <w:lang w:val="fr-FR"/>
+          <w14:ligatures w14:val="none"/>
+        </w:rPr>
+        <w:t xml:space="preserve">cinq sites </w:t>
+      </w:r>
+      <w:ins w:id="188" w:author="Jerry Kalonji" w:date="2026-08-10T14:19:00Z">
+        <w:r>
+          <w:rPr>
+            <w:rFonts w:ascii="Arial" w:eastAsia="Calibri" w:hAnsi="Arial" w:cs="Arial"/>
+            <w:kern w:val="0"/>
+            <w:sz w:val="21"/>
+            <w:szCs w:val="21"/>
+            <w:lang w:val="fr-FR"/>
+            <w14:ligatures w14:val="none"/>
+          </w:rPr>
+          <w:t xml:space="preserve">relevant </w:t>
+        </w:r>
+      </w:ins>
+      <w:r>
+        <w:rPr>
+          <w:rFonts w:ascii="Arial" w:eastAsia="Calibri" w:hAnsi="Arial" w:cs="Arial"/>
+          <w:kern w:val="0"/>
+          <w:sz w:val="21"/>
+          <w:szCs w:val="21"/>
+          <w:lang w:val="fr-FR"/>
+          <w14:ligatures w14:val="none"/>
+        </w:rPr>
+        <w:t xml:space="preserve">du patrimoine culturel </w:t>
+      </w:r>
+      <w:ins w:id="189" w:author="Jerry Kalonji" w:date="2026-08-10T14:19:00Z">
+        <w:r>
+          <w:rPr>
+            <w:rFonts w:ascii="Arial" w:eastAsia="Calibri" w:hAnsi="Arial" w:cs="Arial"/>
+            <w:kern w:val="0"/>
+            <w:sz w:val="21"/>
+            <w:szCs w:val="21"/>
+            <w:lang w:val="fr-FR"/>
+            <w14:ligatures w14:val="none"/>
+          </w:rPr>
+          <w:t xml:space="preserve">matériel </w:t>
+        </w:r>
+      </w:ins>
+      <w:del w:id="190" w:author="Jerry Kalonji" w:date="2026-08-10T14:19:00Z">
+        <w:r>
+          <w:rPr>
+            <w:rFonts w:ascii="Arial" w:eastAsia="Calibri" w:hAnsi="Arial" w:cs="Arial"/>
+            <w:kern w:val="0"/>
+            <w:sz w:val="21"/>
+            <w:szCs w:val="21"/>
+            <w:lang w:val="fr-FR"/>
+            <w14:ligatures w14:val="none"/>
+          </w:rPr>
+          <w:delText xml:space="preserve">a </w:delText>
+        </w:r>
+      </w:del>
+      <w:ins w:id="191" w:author="Jerry Kalonji" w:date="2026-08-10T14:19:00Z">
+        <w:r>
+          <w:rPr>
+            <w:rFonts w:ascii="Arial" w:eastAsia="Calibri" w:hAnsi="Arial" w:cs="Arial"/>
+            <w:kern w:val="0"/>
+            <w:sz w:val="21"/>
+            <w:szCs w:val="21"/>
+            <w:lang w:val="fr-FR"/>
+            <w14:ligatures w14:val="none"/>
+          </w:rPr>
+          <w:t xml:space="preserve">ont </w:t>
+        </w:r>
+      </w:ins>
+      <w:r>
+        <w:rPr>
+          <w:rFonts w:ascii="Arial" w:eastAsia="Calibri" w:hAnsi="Arial" w:cs="Arial"/>
+          <w:kern w:val="0"/>
+          <w:sz w:val="21"/>
+          <w:szCs w:val="21"/>
+          <w:lang w:val="fr-FR"/>
+          <w14:ligatures w14:val="none"/>
+        </w:rPr>
+        <w:t xml:space="preserve">été </w:t>
+      </w:r>
+      <w:del w:id="192" w:author="Jerry Kalonji" w:date="2026-08-10T14:19:00Z">
+        <w:r>
+          <w:rPr>
+            <w:rFonts w:ascii="Arial" w:eastAsia="Calibri" w:hAnsi="Arial" w:cs="Arial"/>
+            <w:kern w:val="0"/>
+            <w:sz w:val="21"/>
+            <w:szCs w:val="21"/>
+            <w:lang w:val="fr-FR"/>
+            <w14:ligatures w14:val="none"/>
+          </w:rPr>
+          <w:delText>identifié</w:delText>
+        </w:r>
+      </w:del>
+      <w:del w:id="193" w:author="Jerry Kalonji" w:date="2026-08-10T14:18:00Z">
+        <w:r>
+          <w:rPr>
+            <w:rFonts w:ascii="Arial" w:eastAsia="Calibri" w:hAnsi="Arial" w:cs="Arial"/>
+            <w:kern w:val="0"/>
+            <w:sz w:val="21"/>
+            <w:szCs w:val="21"/>
+            <w:lang w:val="fr-FR"/>
+            <w14:ligatures w14:val="none"/>
+          </w:rPr>
+          <w:delText>s</w:delText>
+        </w:r>
+      </w:del>
+      <w:ins w:id="194" w:author="Jerry Kalonji" w:date="2026-08-10T14:19:00Z">
+        <w:r>
+          <w:rPr>
+            <w:rFonts w:ascii="Arial" w:eastAsia="Calibri" w:hAnsi="Arial" w:cs="Arial"/>
+            <w:kern w:val="0"/>
+            <w:sz w:val="21"/>
+            <w:szCs w:val="21"/>
+            <w:lang w:val="fr-FR"/>
+            <w14:ligatures w14:val="none"/>
+          </w:rPr>
+          <w:t>recensés</w:t>
+        </w:r>
+      </w:ins>
+      <w:r>
+        <w:rPr>
+          <w:rFonts w:ascii="Arial" w:eastAsia="Calibri" w:hAnsi="Arial" w:cs="Arial"/>
+          <w:kern w:val="0"/>
+          <w:sz w:val="21"/>
+          <w:szCs w:val="21"/>
+          <w:lang w:val="fr-FR"/>
+          <w14:ligatures w14:val="none"/>
+        </w:rPr>
+        <w:t xml:space="preserve"> </w:t>
+      </w:r>
+      <w:del w:id="195" w:author="Jerry Kalonji" w:date="2026-08-10T14:19:00Z">
+        <w:r>
+          <w:rPr>
+            <w:rFonts w:ascii="Arial" w:eastAsia="Calibri" w:hAnsi="Arial" w:cs="Arial"/>
+            <w:kern w:val="0"/>
+            <w:sz w:val="21"/>
+            <w:szCs w:val="21"/>
+            <w:lang w:val="fr-FR"/>
+            <w14:ligatures w14:val="none"/>
+          </w:rPr>
+          <w:delText>comme sites du patrimoine culturel matériel, comme suit</w:delText>
+        </w:r>
+      </w:del>
+      <w:ins w:id="196" w:author="Jerry Kalonji" w:date="2026-08-10T14:20:00Z">
+        <w:r>
+          <w:rPr>
+            <w:rFonts w:ascii="Arial" w:eastAsia="Calibri" w:hAnsi="Arial" w:cs="Arial"/>
+            <w:kern w:val="0"/>
+            <w:sz w:val="21"/>
+            <w:szCs w:val="21"/>
+            <w:lang w:val="fr-FR"/>
+            <w14:ligatures w14:val="none"/>
+          </w:rPr>
+          <w:t>comme présenté ci-dessous</w:t>
+        </w:r>
+      </w:ins>
+      <w:r>
+        <w:rPr>
+          <w:rFonts w:ascii="Arial" w:eastAsia="Calibri" w:hAnsi="Arial" w:cs="Arial"/>
+          <w:kern w:val="0"/>
+          <w:sz w:val="21"/>
+          <w:szCs w:val="21"/>
+          <w:lang w:val="fr-FR"/>
+          <w14:ligatures w14:val="none"/>
+        </w:rPr>
+        <w:t xml:space="preserve"> :</w:t>
       </w:r>
     </w:p>
     <w:p>
@@ -5265,7 +6202,7 @@
       </w:pPr>
       <w:bookmarkStart w:id="203" w:name="_Ref191381922"/>
       <w:bookmarkStart w:id="204" w:name="_Toc191553464"/>
-      <w:ins w:id="90011" w:author="Dr IBRAHIMA DIALLO" w:date="2026-08-17T12:00:00Z">
+      <w:ins w:id="90011" w:author="Dr IBRAHIMA DIALLO" w:date="2026-08-17T13:00:00Z">
         <w:r>
           <w:rPr>
             <w:rFonts w:ascii="Arial" w:eastAsia="Calibri" w:hAnsi="Arial" w:cs="Arial"/>
@@ -5410,18 +6347,34 @@
         <w:instrText xml:space="preserve"> SEQ Tableau \* ARABIC </w:instrText>
         <w:fldChar w:fldCharType="separate"/>
       </w:r>
-      <w:r>
-        <w:rPr>
-          <w:rFonts w:ascii="Arial" w:eastAsia="Calibri" w:hAnsi="Arial" w:cs="Arial"/>
-          <w:noProof/>
-          <w:kern w:val="0"/>
-          <w:sz w:val="20"/>
-          <w:szCs w:val="20"/>
-          <w:lang w:val="fr-FR"/>
-          <w14:ligatures w14:val="none"/>
-        </w:rPr>
-        <w:t>3</w:t>
-      </w:r>
+      <w:ins w:id="206" w:author="Ismael SAMBY" w:date="2026-08-10T16:24:00Z">
+        <w:r>
+          <w:rPr>
+            <w:rFonts w:ascii="Arial" w:eastAsia="Calibri" w:hAnsi="Arial" w:cs="Arial"/>
+            <w:noProof/>
+            <w:kern w:val="0"/>
+            <w:sz w:val="20"/>
+            <w:szCs w:val="20"/>
+            <w:lang w:val="fr-FR"/>
+            <w14:ligatures w14:val="none"/>
+          </w:rPr>
+          <w:t>3</w:t>
+        </w:r>
+      </w:ins>
+      <w:del w:id="207" w:author="Ismael SAMBY" w:date="2026-08-10T16:23:00Z">
+        <w:r>
+          <w:rPr>
+            <w:rFonts w:ascii="Arial" w:eastAsia="Calibri" w:hAnsi="Arial" w:cs="Arial"/>
+            <w:noProof/>
+            <w:kern w:val="0"/>
+            <w:sz w:val="20"/>
+            <w:szCs w:val="20"/>
+            <w:lang w:val="fr-FR"/>
+            <w14:ligatures w14:val="none"/>
+          </w:rPr>
+          <w:delText>1</w:delText>
+        </w:r>
+      </w:del>
       <w:r>
         <w:rPr>
           <w:rFonts w:ascii="Arial" w:eastAsia="Calibri" w:hAnsi="Arial" w:cs="Arial"/>
@@ -6362,7 +7315,7 @@
               </w:rPr>
               <w:t xml:space="preserve">Sont classés comme zones archéologiques, monuments nationaux ou centres historiques en vertu de la </w:t>
             </w:r>
-            <w:del w:id="90002" w:author="Dr IBRAHIMA DIALLO" w:date="2026-08-17T12:00:00Z">
+            <w:del w:id="90002" w:author="Dr IBRAHIMA DIALLO" w:date="2026-08-17T13:00:00Z">
               <w:r>
                 <w:rPr>
                   <w:rFonts w:ascii="Arial" w:eastAsia="Calibri" w:hAnsi="Arial" w:cs="Arial"/>
@@ -6375,7 +7328,7 @@
                 <w:delText xml:space="preserve">loi de 1991 sur les monuments et les reliques</w:delText>
               </w:r>
             </w:del>
-            <w:ins w:id="90003" w:author="Dr IBRAHIMA DIALLO" w:date="2026-08-17T12:00:00Z">
+            <w:ins w:id="90003" w:author="Dr IBRAHIMA DIALLO" w:date="2026-08-17T13:00:00Z">
               <w:r>
                 <w:rPr>
                   <w:rFonts w:ascii="Arial" w:eastAsia="Calibri" w:hAnsi="Arial" w:cs="Arial"/>
@@ -6768,18 +7721,34 @@
         </w:rPr>
         <w:fldChar w:fldCharType="separate"/>
       </w:r>
-      <w:r>
-        <w:rPr>
-          <w:rFonts w:ascii="Arial" w:eastAsia="Calibri" w:hAnsi="Arial" w:cs="Arial"/>
-          <w:noProof/>
-          <w:kern w:val="0"/>
-          <w:sz w:val="20"/>
-          <w:szCs w:val="20"/>
-          <w:lang w:val="fr-FR"/>
-          <w14:ligatures w14:val="none"/>
-        </w:rPr>
-        <w:t>4</w:t>
-      </w:r>
+      <w:ins w:id="237" w:author="Ismael SAMBY" w:date="2026-08-10T16:24:00Z">
+        <w:r>
+          <w:rPr>
+            <w:rFonts w:ascii="Arial" w:eastAsia="Calibri" w:hAnsi="Arial" w:cs="Arial"/>
+            <w:noProof/>
+            <w:kern w:val="0"/>
+            <w:sz w:val="20"/>
+            <w:szCs w:val="20"/>
+            <w:lang w:val="fr-FR"/>
+            <w14:ligatures w14:val="none"/>
+          </w:rPr>
+          <w:t>4</w:t>
+        </w:r>
+      </w:ins>
+      <w:del w:id="238" w:author="Ismael SAMBY" w:date="2026-08-10T16:23:00Z">
+        <w:r>
+          <w:rPr>
+            <w:rFonts w:ascii="Arial" w:eastAsia="Calibri" w:hAnsi="Arial" w:cs="Arial"/>
+            <w:noProof/>
+            <w:kern w:val="0"/>
+            <w:sz w:val="20"/>
+            <w:szCs w:val="20"/>
+            <w:lang w:val="fr-FR"/>
+            <w14:ligatures w14:val="none"/>
+          </w:rPr>
+          <w:delText>2</w:delText>
+        </w:r>
+      </w:del>
       <w:r>
         <w:rPr>
           <w:rFonts w:ascii="Arial" w:eastAsia="Calibri" w:hAnsi="Arial" w:cs="Arial"/>
@@ -8583,7 +9552,55 @@
           <w:lang w:val="fr-FR"/>
           <w14:ligatures w14:val="none"/>
         </w:rPr>
-        <w:t xml:space="preserve">Compte tenu de l’importance de ces sites pour les communautés concernées, il est recommandé d’organiser, en amont des travaux des consultations spécifiques avec les détenteurs des traditions, les autorités locales et les communautés concernées afin de déterminer et de valider les mesures rituelles et culturelles appropriées, y compris, le cas échéant, les sacrifices ou autres cérémonies traditionnellement requis. Ces mesures devront être mises en œuvre en conformité avec les pratiques culturelles locales et selon la procédure de compensation et de gestion des sites sacrés du Projet WCAG.</w:t>
+        <w:t xml:space="preserve">Compte tenu de l’importance de ces sites </w:t>
+      </w:r>
+      <w:del w:id="251" w:author="Jerry Kalonji" w:date="2026-08-10T14:22:00Z">
+        <w:r>
+          <w:rPr>
+            <w:rFonts w:ascii="Arial" w:eastAsia="Calibri" w:hAnsi="Arial" w:cs="Arial"/>
+            <w:kern w:val="0"/>
+            <w:sz w:val="21"/>
+            <w:szCs w:val="21"/>
+            <w:lang w:val="fr-FR"/>
+            <w14:ligatures w14:val="none"/>
+          </w:rPr>
+          <w:delText xml:space="preserve">et de leur importance </w:delText>
+        </w:r>
+      </w:del>
+      <w:r>
+        <w:rPr>
+          <w:rFonts w:ascii="Arial" w:eastAsia="Calibri" w:hAnsi="Arial" w:cs="Arial"/>
+          <w:kern w:val="0"/>
+          <w:sz w:val="21"/>
+          <w:szCs w:val="21"/>
+          <w:lang w:val="fr-FR"/>
+          <w14:ligatures w14:val="none"/>
+        </w:rPr>
+        <w:t>pour les communautés concernées, il est recommandé d’organiser, en amont des travaux</w:t>
+      </w:r>
+      <w:del w:id="252" w:author="Jerry Kalonji" w:date="2026-08-10T14:23:00Z">
+        <w:r>
+          <w:rPr>
+            <w:rFonts w:ascii="Arial" w:eastAsia="Calibri" w:hAnsi="Arial" w:cs="Arial"/>
+            <w:kern w:val="0"/>
+            <w:sz w:val="21"/>
+            <w:szCs w:val="21"/>
+            <w:lang w:val="fr-FR"/>
+            <w14:ligatures w14:val="none"/>
+          </w:rPr>
+          <w:delText>,</w:delText>
+        </w:r>
+      </w:del>
+      <w:r>
+        <w:rPr>
+          <w:rFonts w:ascii="Arial" w:eastAsia="Calibri" w:hAnsi="Arial" w:cs="Arial"/>
+          <w:kern w:val="0"/>
+          <w:sz w:val="21"/>
+          <w:szCs w:val="21"/>
+          <w:lang w:val="fr-FR"/>
+          <w14:ligatures w14:val="none"/>
+        </w:rPr>
+        <w:t xml:space="preserve"> des consultations spécifiques avec les détenteurs des traditions, les autorités locales et les communautés concernées afin de déterminer et de valider les mesures rituelles et culturelles appropriées, y compris, le cas échéant, les sacrifices ou autres cérémonies traditionnellement requis. Ces mesures devront être mises en œuvre en conformité avec les pratiques culturelles locales et selon la procédure de compensation et de gestion des sites sacrés du Projet WCAG.</w:t>
       </w:r>
     </w:p>
     <w:p>
@@ -9137,49 +10154,64 @@
         <w:instrText xml:space="preserve"> REF _Ref191658378 \h  \* MERGEFORMAT </w:instrText>
         <w:fldChar w:fldCharType="separate"/>
       </w:r>
-      <w:r>
-        <w:rPr>
-          <w:rFonts w:ascii="Arial" w:eastAsia="Calibri" w:hAnsi="Arial" w:cs="Arial"/>
-          <w:kern w:val="0"/>
-          <w:sz w:val="21"/>
-          <w:szCs w:val="21"/>
-          <w:lang w:val="fr-FR"/>
-          <w14:ligatures w14:val="none"/>
-          <w:rPrChange w:id="263" w:author="Ismael SAMBY" w:date="2026-08-10T16:25:00Z">
-            <w:rPr>
-              <w:rFonts w:ascii="Arial" w:eastAsia="Calibri" w:hAnsi="Arial" w:cs="Arial"/>
-              <w:kern w:val="0"/>
-              <w:sz w:val="20"/>
-              <w:szCs w:val="20"/>
-              <w:lang w:val="fr-FR"/>
-              <w14:ligatures w14:val="none"/>
-            </w:rPr>
-          </w:rPrChange>
-        </w:rPr>
-        <w:t xml:space="preserve">Tableau </w:t>
-      </w:r>
-      <w:r>
-        <w:rPr>
-          <w:rFonts w:ascii="Arial" w:eastAsia="Calibri" w:hAnsi="Arial" w:cs="Arial"/>
-          <w:kern w:val="0"/>
-          <w:sz w:val="21"/>
-          <w:szCs w:val="21"/>
-          <w:lang w:val="fr-FR"/>
-          <w14:ligatures w14:val="none"/>
-          <w:rPrChange w:id="264" w:author="Ismael SAMBY" w:date="2026-08-10T16:25:00Z">
-            <w:rPr>
-              <w:rFonts w:ascii="Arial" w:eastAsia="Calibri" w:hAnsi="Arial" w:cs="Arial"/>
-              <w:noProof/>
-              <w:kern w:val="0"/>
-              <w:sz w:val="20"/>
-              <w:szCs w:val="20"/>
-              <w:lang w:val="fr-FR"/>
-              <w14:ligatures w14:val="none"/>
-            </w:rPr>
-          </w:rPrChange>
-        </w:rPr>
-        <w:t>5</w:t>
-      </w:r>
+      <w:ins w:id="262" w:author="Ismael SAMBY" w:date="2026-08-10T16:25:00Z">
+        <w:r>
+          <w:rPr>
+            <w:rFonts w:ascii="Arial" w:eastAsia="Calibri" w:hAnsi="Arial" w:cs="Arial"/>
+            <w:kern w:val="0"/>
+            <w:sz w:val="21"/>
+            <w:szCs w:val="21"/>
+            <w:lang w:val="fr-FR"/>
+            <w14:ligatures w14:val="none"/>
+            <w:rPrChange w:id="263" w:author="Ismael SAMBY" w:date="2026-08-10T16:25:00Z">
+              <w:rPr>
+                <w:rFonts w:ascii="Arial" w:eastAsia="Calibri" w:hAnsi="Arial" w:cs="Arial"/>
+                <w:kern w:val="0"/>
+                <w:sz w:val="20"/>
+                <w:szCs w:val="20"/>
+                <w:lang w:val="fr-FR"/>
+                <w14:ligatures w14:val="none"/>
+              </w:rPr>
+            </w:rPrChange>
+          </w:rPr>
+          <w:t xml:space="preserve">Tableau </w:t>
+        </w:r>
+        <w:r>
+          <w:rPr>
+            <w:rFonts w:ascii="Arial" w:eastAsia="Calibri" w:hAnsi="Arial" w:cs="Arial"/>
+            <w:kern w:val="0"/>
+            <w:sz w:val="21"/>
+            <w:szCs w:val="21"/>
+            <w:lang w:val="fr-FR"/>
+            <w14:ligatures w14:val="none"/>
+            <w:rPrChange w:id="264" w:author="Ismael SAMBY" w:date="2026-08-10T16:25:00Z">
+              <w:rPr>
+                <w:rFonts w:ascii="Arial" w:eastAsia="Calibri" w:hAnsi="Arial" w:cs="Arial"/>
+                <w:noProof/>
+                <w:kern w:val="0"/>
+                <w:sz w:val="20"/>
+                <w:szCs w:val="20"/>
+                <w:lang w:val="fr-FR"/>
+                <w14:ligatures w14:val="none"/>
+              </w:rPr>
+            </w:rPrChange>
+          </w:rPr>
+          <w:t>5</w:t>
+        </w:r>
+      </w:ins>
+      <w:del w:id="265" w:author="Ismael SAMBY" w:date="2026-08-10T16:25:00Z">
+        <w:r>
+          <w:rPr>
+            <w:rFonts w:ascii="Arial" w:eastAsia="Calibri" w:hAnsi="Arial" w:cs="Arial"/>
+            <w:kern w:val="0"/>
+            <w:sz w:val="21"/>
+            <w:szCs w:val="21"/>
+            <w:lang w:val="fr-FR"/>
+            <w14:ligatures w14:val="none"/>
+          </w:rPr>
+          <w:delText>Tableau 3</w:delText>
+        </w:r>
+      </w:del>
       <w:r>
         <w:rPr>
           <w:rFonts w:ascii="Arial" w:eastAsia="Calibri" w:hAnsi="Arial" w:cs="Arial"/>
@@ -9257,18 +10289,34 @@
         <w:instrText xml:space="preserve"> SEQ Tableau \* ARABIC </w:instrText>
         <w:fldChar w:fldCharType="separate"/>
       </w:r>
-      <w:r>
-        <w:rPr>
-          <w:rFonts w:ascii="Arial" w:eastAsia="Calibri" w:hAnsi="Arial" w:cs="Arial"/>
-          <w:noProof/>
-          <w:kern w:val="0"/>
-          <w:sz w:val="20"/>
-          <w:szCs w:val="20"/>
-          <w:lang w:val="fr-FR"/>
-          <w14:ligatures w14:val="none"/>
-        </w:rPr>
-        <w:t>5</w:t>
-      </w:r>
+      <w:ins w:id="269" w:author="Ismael SAMBY" w:date="2026-08-10T16:24:00Z">
+        <w:r>
+          <w:rPr>
+            <w:rFonts w:ascii="Arial" w:eastAsia="Calibri" w:hAnsi="Arial" w:cs="Arial"/>
+            <w:noProof/>
+            <w:kern w:val="0"/>
+            <w:sz w:val="20"/>
+            <w:szCs w:val="20"/>
+            <w:lang w:val="fr-FR"/>
+            <w14:ligatures w14:val="none"/>
+          </w:rPr>
+          <w:t>5</w:t>
+        </w:r>
+      </w:ins>
+      <w:del w:id="270" w:author="Ismael SAMBY" w:date="2026-08-10T16:23:00Z">
+        <w:r>
+          <w:rPr>
+            <w:rFonts w:ascii="Arial" w:eastAsia="Calibri" w:hAnsi="Arial" w:cs="Arial"/>
+            <w:noProof/>
+            <w:kern w:val="0"/>
+            <w:sz w:val="20"/>
+            <w:szCs w:val="20"/>
+            <w:lang w:val="fr-FR"/>
+            <w14:ligatures w14:val="none"/>
+          </w:rPr>
+          <w:delText>3</w:delText>
+        </w:r>
+      </w:del>
       <w:r>
         <w:rPr>
           <w:rFonts w:ascii="Arial" w:eastAsia="Calibri" w:hAnsi="Arial" w:cs="Arial"/>
@@ -10702,6 +11750,7 @@
         <w:spacing w:after="0" w:line="276" w:lineRule="auto"/>
         <w:jc w:val="both"/>
         <w:rPr>
+          <w:del w:id="309" w:author="Ismael SAMBY" w:date="2026-08-10T16:22:00Z"/>
           <w:rFonts w:ascii="Arial" w:eastAsia="Calibri" w:hAnsi="Arial" w:cs="Arial"/>
           <w:kern w:val="0"/>
           <w:sz w:val="21"/>
@@ -10721,9 +11770,303 @@
         </w:rPr>
         <w:br/>
       </w:r>
+    </w:p>
+    <w:p>
+      <w:pPr>
+        <w:spacing w:after="0" w:line="276" w:lineRule="auto"/>
+        <w:jc w:val="both"/>
+        <w:rPr>
+          <w:del w:id="310" w:author="Ismael SAMBY" w:date="2026-08-10T16:22:00Z"/>
+          <w:rFonts w:ascii="Arial" w:eastAsia="Calibri" w:hAnsi="Arial" w:cs="Arial"/>
+          <w:kern w:val="0"/>
+          <w:sz w:val="21"/>
+          <w:szCs w:val="21"/>
+          <w:lang w:val="fr-FR"/>
+          <w14:ligatures w14:val="none"/>
+        </w:rPr>
+      </w:pPr>
+    </w:p>
+    <w:p>
+      <w:pPr>
+        <w:spacing w:after="0" w:line="276" w:lineRule="auto"/>
+        <w:jc w:val="both"/>
+        <w:rPr>
+          <w:del w:id="311" w:author="Ismael SAMBY" w:date="2026-08-10T16:22:00Z"/>
+          <w:rFonts w:ascii="Arial" w:eastAsia="Calibri" w:hAnsi="Arial" w:cs="Arial"/>
+          <w:kern w:val="0"/>
+          <w:sz w:val="21"/>
+          <w:szCs w:val="21"/>
+          <w:lang w:val="fr-FR"/>
+          <w14:ligatures w14:val="none"/>
+        </w:rPr>
+      </w:pPr>
+    </w:p>
+    <w:p>
+      <w:pPr>
+        <w:spacing w:after="0" w:line="276" w:lineRule="auto"/>
+        <w:jc w:val="both"/>
+        <w:rPr>
+          <w:del w:id="312" w:author="Ismael SAMBY" w:date="2026-08-10T16:22:00Z"/>
+          <w:rFonts w:ascii="Arial" w:eastAsia="Calibri" w:hAnsi="Arial" w:cs="Arial"/>
+          <w:kern w:val="0"/>
+          <w:sz w:val="21"/>
+          <w:szCs w:val="21"/>
+          <w:lang w:val="fr-FR"/>
+          <w14:ligatures w14:val="none"/>
+        </w:rPr>
+      </w:pPr>
+    </w:p>
+    <w:p>
+      <w:pPr>
+        <w:spacing w:after="0" w:line="276" w:lineRule="auto"/>
+        <w:jc w:val="both"/>
+        <w:rPr>
+          <w:del w:id="313" w:author="Ismael SAMBY" w:date="2026-08-10T16:22:00Z"/>
+          <w:rFonts w:ascii="Arial" w:eastAsia="Calibri" w:hAnsi="Arial" w:cs="Arial"/>
+          <w:kern w:val="0"/>
+          <w:sz w:val="21"/>
+          <w:szCs w:val="21"/>
+          <w:lang w:val="fr-FR"/>
+          <w14:ligatures w14:val="none"/>
+        </w:rPr>
+      </w:pPr>
+    </w:p>
+    <w:p>
+      <w:pPr>
+        <w:spacing w:after="0" w:line="276" w:lineRule="auto"/>
+        <w:jc w:val="both"/>
+        <w:rPr>
+          <w:del w:id="314" w:author="Ismael SAMBY" w:date="2026-08-10T16:22:00Z"/>
+          <w:rFonts w:ascii="Arial" w:eastAsia="Calibri" w:hAnsi="Arial" w:cs="Arial"/>
+          <w:kern w:val="0"/>
+          <w:sz w:val="21"/>
+          <w:szCs w:val="21"/>
+          <w:lang w:val="fr-FR"/>
+          <w14:ligatures w14:val="none"/>
+        </w:rPr>
+      </w:pPr>
+    </w:p>
+    <w:p>
+      <w:pPr>
+        <w:spacing w:after="0" w:line="276" w:lineRule="auto"/>
+        <w:jc w:val="both"/>
+        <w:rPr>
+          <w:del w:id="315" w:author="Ismael SAMBY" w:date="2026-08-10T16:22:00Z"/>
+          <w:rFonts w:ascii="Arial" w:eastAsia="Calibri" w:hAnsi="Arial" w:cs="Arial"/>
+          <w:kern w:val="0"/>
+          <w:sz w:val="21"/>
+          <w:szCs w:val="21"/>
+          <w:lang w:val="fr-FR"/>
+          <w14:ligatures w14:val="none"/>
+        </w:rPr>
+      </w:pPr>
+    </w:p>
+    <w:p>
+      <w:pPr>
+        <w:spacing w:after="0" w:line="276" w:lineRule="auto"/>
+        <w:jc w:val="both"/>
+        <w:rPr>
+          <w:del w:id="316" w:author="Ismael SAMBY" w:date="2026-08-10T16:22:00Z"/>
+          <w:rFonts w:ascii="Arial" w:eastAsia="Calibri" w:hAnsi="Arial" w:cs="Arial"/>
+          <w:kern w:val="0"/>
+          <w:sz w:val="21"/>
+          <w:szCs w:val="21"/>
+          <w:lang w:val="fr-FR"/>
+          <w14:ligatures w14:val="none"/>
+        </w:rPr>
+      </w:pPr>
+    </w:p>
+    <w:p>
+      <w:pPr>
+        <w:spacing w:after="0" w:line="276" w:lineRule="auto"/>
+        <w:jc w:val="both"/>
+        <w:rPr>
+          <w:del w:id="317" w:author="Ismael SAMBY" w:date="2026-08-10T16:22:00Z"/>
+          <w:rFonts w:ascii="Arial" w:eastAsia="Calibri" w:hAnsi="Arial" w:cs="Arial"/>
+          <w:kern w:val="0"/>
+          <w:sz w:val="21"/>
+          <w:szCs w:val="21"/>
+          <w:lang w:val="fr-FR"/>
+          <w14:ligatures w14:val="none"/>
+        </w:rPr>
+      </w:pPr>
+    </w:p>
+    <w:p>
+      <w:pPr>
+        <w:spacing w:after="0" w:line="276" w:lineRule="auto"/>
+        <w:jc w:val="both"/>
+        <w:rPr>
+          <w:del w:id="318" w:author="Ismael SAMBY" w:date="2026-08-10T16:22:00Z"/>
+          <w:rFonts w:ascii="Arial" w:eastAsia="Calibri" w:hAnsi="Arial" w:cs="Arial"/>
+          <w:kern w:val="0"/>
+          <w:sz w:val="21"/>
+          <w:szCs w:val="21"/>
+          <w:lang w:val="fr-FR"/>
+          <w14:ligatures w14:val="none"/>
+        </w:rPr>
+      </w:pPr>
+    </w:p>
+    <w:p>
+      <w:pPr>
+        <w:spacing w:after="0" w:line="276" w:lineRule="auto"/>
+        <w:jc w:val="both"/>
+        <w:rPr>
+          <w:del w:id="319" w:author="Ismael SAMBY" w:date="2026-08-10T16:22:00Z"/>
+          <w:rFonts w:ascii="Arial" w:eastAsia="Calibri" w:hAnsi="Arial" w:cs="Arial"/>
+          <w:kern w:val="0"/>
+          <w:sz w:val="21"/>
+          <w:szCs w:val="21"/>
+          <w:lang w:val="fr-FR"/>
+          <w14:ligatures w14:val="none"/>
+        </w:rPr>
+      </w:pPr>
+    </w:p>
+    <w:p>
+      <w:pPr>
+        <w:spacing w:after="0" w:line="276" w:lineRule="auto"/>
+        <w:jc w:val="both"/>
+        <w:rPr>
+          <w:del w:id="320" w:author="Ismael SAMBY" w:date="2026-08-10T16:22:00Z"/>
+          <w:rFonts w:ascii="Arial" w:eastAsia="Calibri" w:hAnsi="Arial" w:cs="Arial"/>
+          <w:kern w:val="0"/>
+          <w:sz w:val="21"/>
+          <w:szCs w:val="21"/>
+          <w:lang w:val="fr-FR"/>
+          <w14:ligatures w14:val="none"/>
+        </w:rPr>
+      </w:pPr>
+    </w:p>
+    <w:p>
+      <w:pPr>
+        <w:spacing w:after="0" w:line="276" w:lineRule="auto"/>
+        <w:jc w:val="both"/>
+        <w:rPr>
+          <w:del w:id="321" w:author="Ismael SAMBY" w:date="2026-08-10T16:22:00Z"/>
+          <w:rFonts w:ascii="Arial" w:eastAsia="Calibri" w:hAnsi="Arial" w:cs="Arial"/>
+          <w:kern w:val="0"/>
+          <w:sz w:val="21"/>
+          <w:szCs w:val="21"/>
+          <w:lang w:val="fr-FR"/>
+          <w14:ligatures w14:val="none"/>
+        </w:rPr>
+      </w:pPr>
+    </w:p>
+    <w:p>
+      <w:pPr>
+        <w:spacing w:after="0" w:line="276" w:lineRule="auto"/>
+        <w:jc w:val="both"/>
+        <w:rPr>
+          <w:del w:id="322" w:author="Ismael SAMBY" w:date="2026-08-10T16:22:00Z"/>
+          <w:rFonts w:ascii="Arial" w:eastAsia="Calibri" w:hAnsi="Arial" w:cs="Arial"/>
+          <w:kern w:val="0"/>
+          <w:sz w:val="21"/>
+          <w:szCs w:val="21"/>
+          <w:lang w:val="fr-FR"/>
+          <w14:ligatures w14:val="none"/>
+        </w:rPr>
+      </w:pPr>
+    </w:p>
+    <w:p>
+      <w:pPr>
+        <w:spacing w:after="0" w:line="276" w:lineRule="auto"/>
+        <w:jc w:val="both"/>
+        <w:rPr>
+          <w:del w:id="323" w:author="Ismael SAMBY" w:date="2026-08-10T16:22:00Z"/>
+          <w:rFonts w:ascii="Arial" w:eastAsia="Calibri" w:hAnsi="Arial" w:cs="Arial"/>
+          <w:kern w:val="0"/>
+          <w:sz w:val="21"/>
+          <w:szCs w:val="21"/>
+          <w:lang w:val="fr-FR"/>
+          <w14:ligatures w14:val="none"/>
+        </w:rPr>
+      </w:pPr>
+    </w:p>
+    <w:p>
+      <w:pPr>
+        <w:spacing w:after="0" w:line="276" w:lineRule="auto"/>
+        <w:jc w:val="both"/>
+        <w:rPr>
+          <w:del w:id="324" w:author="Ismael SAMBY" w:date="2026-08-10T16:22:00Z"/>
+          <w:rFonts w:ascii="Arial" w:eastAsia="Calibri" w:hAnsi="Arial" w:cs="Arial"/>
+          <w:kern w:val="0"/>
+          <w:sz w:val="21"/>
+          <w:szCs w:val="21"/>
+          <w:lang w:val="fr-FR"/>
+          <w14:ligatures w14:val="none"/>
+        </w:rPr>
+      </w:pPr>
+    </w:p>
+    <w:p>
+      <w:pPr>
+        <w:spacing w:after="0" w:line="276" w:lineRule="auto"/>
+        <w:jc w:val="both"/>
+        <w:rPr>
+          <w:del w:id="325" w:author="Ismael SAMBY" w:date="2026-08-10T16:22:00Z"/>
+          <w:rFonts w:ascii="Arial" w:eastAsia="Calibri" w:hAnsi="Arial" w:cs="Arial"/>
+          <w:kern w:val="0"/>
+          <w:sz w:val="21"/>
+          <w:szCs w:val="21"/>
+          <w:lang w:val="fr-FR"/>
+          <w14:ligatures w14:val="none"/>
+        </w:rPr>
+      </w:pPr>
+    </w:p>
+    <w:p>
+      <w:pPr>
+        <w:keepNext/>
+        <w:keepLines/>
+        <w:spacing w:after="0" w:line="276" w:lineRule="auto"/>
+        <w:ind w:left="360"/>
+        <w:jc w:val="both"/>
+        <w:outlineLvl w:val="0"/>
+        <w:rPr>
+          <w:del w:id="326" w:author="Ismael SAMBY" w:date="2026-08-10T16:22:00Z"/>
+          <w:rFonts w:ascii="Arial" w:eastAsia="Times New Roman" w:hAnsi="Arial" w:cs="Arial"/>
+          <w:color w:val="2E74B5"/>
+          <w:kern w:val="0"/>
+          <w:sz w:val="21"/>
+          <w:szCs w:val="21"/>
+          <w:lang w:val="fr-FR"/>
+          <w14:ligatures w14:val="none"/>
+        </w:rPr>
+      </w:pPr>
       <w:bookmarkStart w:id="327" w:name="_Toc194299240"/>
       <w:bookmarkStart w:id="328" w:name="_Toc89424237"/>
       <w:bookmarkStart w:id="329" w:name="_Toc89424241"/>
+    </w:p>
+    <w:p>
+      <w:pPr>
+        <w:keepNext/>
+        <w:keepLines/>
+        <w:spacing w:after="0" w:line="276" w:lineRule="auto"/>
+        <w:ind w:left="360"/>
+        <w:jc w:val="both"/>
+        <w:outlineLvl w:val="0"/>
+        <w:rPr>
+          <w:del w:id="330" w:author="Ismael SAMBY" w:date="2026-08-10T16:22:00Z"/>
+          <w:rFonts w:ascii="Arial" w:eastAsia="Times New Roman" w:hAnsi="Arial" w:cs="Arial"/>
+          <w:color w:val="2E74B5"/>
+          <w:kern w:val="0"/>
+          <w:sz w:val="21"/>
+          <w:szCs w:val="21"/>
+          <w:lang w:val="fr-FR"/>
+          <w14:ligatures w14:val="none"/>
+        </w:rPr>
+      </w:pPr>
+    </w:p>
+    <w:p>
+      <w:pPr>
+        <w:spacing w:after="0" w:line="276" w:lineRule="auto"/>
+        <w:jc w:val="both"/>
+        <w:rPr>
+          <w:rFonts w:ascii="Arial" w:eastAsia="Calibri" w:hAnsi="Arial" w:cs="Arial"/>
+          <w:kern w:val="0"/>
+          <w:sz w:val="21"/>
+          <w:szCs w:val="21"/>
+          <w:lang w:val="fr-FR"/>
+          <w14:ligatures w14:val="none"/>
+        </w:rPr>
+      </w:pPr>
       <w:bookmarkStart w:id="331" w:name="_Toc89424232"/>
       <w:bookmarkEnd w:id="327"/>
     </w:p>
@@ -10792,7 +12135,7 @@
         </w:rPr>
         <w:t xml:space="preserve">Les travaux de terrassement profonds dans une zone à forte densité culturelle Baga et Nalou (histoire multiséculaire) présentent un risque de mise à jour fortuite de vestiges non répertoriés : sépultures anciennes, artefacts, sites rituels inconnus, objets archéologiques</w:t>
       </w:r>
-      <w:ins w:id="90010" w:author="Dr IBRAHIMA DIALLO" w:date="2026-08-17T12:00:00Z">
+      <w:ins w:id="90010" w:author="Dr IBRAHIMA DIALLO" w:date="2026-08-17T13:00:00Z">
         <w:r>
           <w:rPr>
             <w:rFonts w:ascii="Arial" w:eastAsia="Calibri" w:hAnsi="Arial" w:cs="Arial"/>
@@ -12705,7 +14048,25 @@
                 <w:szCs w:val="18"/>
                 <w:lang w:val="fr-FR"/>
               </w:rPr>
-              <w:t xml:space="preserve">Relations communautaires de WCAG +</w:t>
+              <w:t>Relations communautaire</w:t>
+            </w:r>
+            <w:ins w:id="332" w:author="Jerry Kalonji" w:date="2026-08-10T14:24:00Z">
+              <w:r>
+                <w:rPr>
+                  <w:sz w:val="18"/>
+                  <w:szCs w:val="18"/>
+                  <w:lang w:val="fr-FR"/>
+                </w:rPr>
+                <w:t>s</w:t>
+              </w:r>
+            </w:ins>
+            <w:r>
+              <w:rPr>
+                <w:sz w:val="18"/>
+                <w:szCs w:val="18"/>
+                <w:lang w:val="fr-FR"/>
+              </w:rPr>
+              <w:t xml:space="preserve"> de WCAG +</w:t>
             </w:r>
           </w:p>
           <w:p>
@@ -14959,7 +16320,7 @@
               </w:rPr>
               <w:t xml:space="preserve">pH, conductivité, turbidité, métaux lourds (As, Pb, Na, Al)</w:t>
             </w:r>
-            <w:del w:id="90006" w:author="Dr IBRAHIMA DIALLO" w:date="2026-08-17T12:00:00Z">
+            <w:del w:id="90006" w:author="Dr IBRAHIMA DIALLO" w:date="2026-08-17T13:00:00Z">
               <w:r>
                 <w:rPr>
                   <w:sz w:val="18"/>
@@ -14969,7 +16330,7 @@
                 <w:delText xml:space="preserve"> dans l'eau de la mare sacrée de Dawakar</w:delText>
               </w:r>
             </w:del>
-            <w:ins w:id="90007" w:author="Dr IBRAHIMA DIALLO" w:date="2026-08-17T12:00:00Z">
+            <w:ins w:id="90007" w:author="Dr IBRAHIMA DIALLO" w:date="2026-08-17T13:00:00Z">
               <w:r>
                 <w:rPr>
                   <w:sz w:val="18"/>
@@ -15181,7 +16542,7 @@
               </w:rPr>
               <w:t xml:space="preserve">Mesure des niveaux sonores</w:t>
             </w:r>
-            <w:ins w:id="90008" w:author="Dr IBRAHIMA DIALLO" w:date="2026-08-17T12:00:00Z">
+            <w:ins w:id="90008" w:author="Dr IBRAHIMA DIALLO" w:date="2026-08-17T13:00:00Z">
               <w:r>
                 <w:rPr>
                   <w:sz w:val="18"/>
@@ -15296,7 +16657,7 @@
               </w:rPr>
               <w:t xml:space="preserve">Mesure des vibrations</w:t>
             </w:r>
-            <w:ins w:id="90009" w:author="Dr IBRAHIMA DIALLO" w:date="2026-08-17T12:00:00Z">
+            <w:ins w:id="90009" w:author="Dr IBRAHIMA DIALLO" w:date="2026-08-17T13:00:00Z">
               <w:r>
                 <w:rPr>
                   <w:sz w:val="18"/>
@@ -15690,6 +17051,71 @@
           <w14:ligatures w14:val="none"/>
         </w:rPr>
       </w:pPr>
+      <w:commentRangeStart w:id="333"/>
+      <w:commentRangeStart w:id="334"/>
+      <w:del w:id="335" w:author="Ismael SAMBY" w:date="2026-08-10T16:20:00Z">
+        <w:r>
+          <w:rPr>
+            <w:rFonts w:ascii="Arial" w:eastAsia="Times New Roman" w:hAnsi="Arial" w:cs="Arial"/>
+            <w:b/>
+            <w:kern w:val="0"/>
+            <w:sz w:val="21"/>
+            <w:szCs w:val="21"/>
+            <w:lang w:val="fr-FR"/>
+            <w14:ligatures w14:val="none"/>
+          </w:rPr>
+          <w:delText>Structure</w:delText>
+        </w:r>
+        <w:commentRangeEnd w:id="333"/>
+        <w:r>
+          <w:rPr>
+            <w:rStyle w:val="Marquedecommentaire"/>
+            <w:rFonts w:ascii="Arial" w:eastAsia="Times New Roman" w:hAnsi="Arial" w:cs="Arial"/>
+            <w:b/>
+            <w:kern w:val="0"/>
+            <w:sz w:val="21"/>
+            <w:szCs w:val="21"/>
+            <w:lang w:val="fr-FR"/>
+            <w14:ligatures w14:val="none"/>
+          </w:rPr>
+          <w:commentReference w:id="333"/>
+        </w:r>
+      </w:del>
+      <w:commentRangeEnd w:id="334"/>
+      <w:r>
+        <w:rPr>
+          <w:rStyle w:val="Marquedecommentaire"/>
+        </w:rPr>
+        <w:commentReference w:id="334"/>
+      </w:r>
+      <w:del w:id="336" w:author="Ismael SAMBY" w:date="2026-08-10T16:20:00Z">
+        <w:r>
+          <w:rPr>
+            <w:rFonts w:ascii="Arial" w:eastAsia="Times New Roman" w:hAnsi="Arial" w:cs="Arial"/>
+            <w:b/>
+            <w:kern w:val="0"/>
+            <w:sz w:val="21"/>
+            <w:szCs w:val="21"/>
+            <w:lang w:val="fr-FR"/>
+            <w14:ligatures w14:val="none"/>
+          </w:rPr>
+          <w:delText xml:space="preserve"> </w:delText>
+        </w:r>
+      </w:del>
+      <w:ins w:id="337" w:author="Ismael SAMBY" w:date="2026-08-10T16:20:00Z">
+        <w:r>
+          <w:rPr>
+            <w:rFonts w:ascii="Arial" w:eastAsia="Times New Roman" w:hAnsi="Arial" w:cs="Arial"/>
+            <w:b/>
+            <w:kern w:val="0"/>
+            <w:sz w:val="21"/>
+            <w:szCs w:val="21"/>
+            <w:lang w:val="fr-FR"/>
+            <w14:ligatures w14:val="none"/>
+          </w:rPr>
+          <w:t xml:space="preserve">Contenu </w:t>
+        </w:r>
+      </w:ins>
       <w:r>
         <w:rPr>
           <w:rFonts w:ascii="Arial" w:eastAsia="Times New Roman" w:hAnsi="Arial" w:cs="Arial"/>
@@ -15700,7 +17126,7 @@
           <w:lang w:val="fr-FR"/>
           <w14:ligatures w14:val="none"/>
         </w:rPr>
-        <w:t xml:space="preserve">Contenu des rapports de suivi</w:t>
+        <w:t>des rapports de suivi</w:t>
       </w:r>
     </w:p>
     <w:p>
@@ -16000,7 +17426,103 @@
           <w:lang w:val="fr-FR" w:eastAsia="fr-FR"/>
           <w14:ligatures w14:val="none"/>
         </w:rPr>
-        <w:t>La mise en œuvre du présent PGPC nécessite la mobilisation de ressources financières dédiées, réparties sur l'ensemble des phases du Projet.. Conformément au principe de proportionnalité retenu pour ce chapitre, les montants précis sont chiffrés dans le PGES.</w:t>
+        <w:t>La mise en œuvre du présent PGPC nécessite la mobilisation de ressources financières dédiées, réparties sur l'ensemble des phases du Projet.</w:t>
+      </w:r>
+      <w:del w:id="338" w:author="Ismael SAMBY" w:date="2026-08-10T16:21:00Z">
+        <w:r>
+          <w:rPr>
+            <w:rFonts w:ascii="Arial" w:eastAsia="Arial" w:hAnsi="Arial" w:cs="Arial"/>
+            <w:kern w:val="0"/>
+            <w:sz w:val="21"/>
+            <w:szCs w:val="21"/>
+            <w:lang w:val="fr-FR" w:eastAsia="fr-FR"/>
+            <w14:ligatures w14:val="none"/>
+          </w:rPr>
+          <w:delText xml:space="preserve"> </w:delText>
+        </w:r>
+        <w:commentRangeStart w:id="339"/>
+        <w:commentRangeStart w:id="340"/>
+        <w:r>
+          <w:rPr>
+            <w:rFonts w:ascii="Arial" w:eastAsia="Arial" w:hAnsi="Arial" w:cs="Arial"/>
+            <w:kern w:val="0"/>
+            <w:sz w:val="21"/>
+            <w:szCs w:val="21"/>
+            <w:lang w:val="fr-FR" w:eastAsia="fr-FR"/>
+            <w14:ligatures w14:val="none"/>
+          </w:rPr>
+          <w:delText xml:space="preserve">Le tableau suivant </w:delText>
+        </w:r>
+        <w:commentRangeEnd w:id="339"/>
+        <w:r>
+          <w:rPr>
+            <w:rStyle w:val="Marquedecommentaire"/>
+            <w:rFonts w:ascii="Arial" w:eastAsia="Arial" w:hAnsi="Arial" w:cs="Arial"/>
+            <w:kern w:val="0"/>
+            <w:sz w:val="21"/>
+            <w:szCs w:val="21"/>
+            <w:lang w:val="fr-FR" w:eastAsia="fr-FR"/>
+            <w14:ligatures w14:val="none"/>
+          </w:rPr>
+          <w:commentReference w:id="339"/>
+        </w:r>
+      </w:del>
+      <w:commentRangeEnd w:id="340"/>
+      <w:r>
+        <w:rPr>
+          <w:rStyle w:val="Marquedecommentaire"/>
+        </w:rPr>
+        <w:commentReference w:id="340"/>
+      </w:r>
+      <w:del w:id="341" w:author="Ismael SAMBY" w:date="2026-08-10T16:21:00Z">
+        <w:r>
+          <w:rPr>
+            <w:rFonts w:ascii="Arial" w:eastAsia="Arial" w:hAnsi="Arial" w:cs="Arial"/>
+            <w:kern w:val="0"/>
+            <w:sz w:val="21"/>
+            <w:szCs w:val="21"/>
+            <w:lang w:val="fr-FR" w:eastAsia="fr-FR"/>
+            <w14:ligatures w14:val="none"/>
+          </w:rPr>
+          <w:delText>présente les principaux postes budgétaires identifiés à ce stade</w:delText>
+        </w:r>
+      </w:del>
+      <w:ins w:id="342" w:author="Ismael SAMBY" w:date="2026-08-10T16:21:00Z">
+        <w:r>
+          <w:rPr>
+            <w:rFonts w:ascii="Arial" w:eastAsia="Arial" w:hAnsi="Arial" w:cs="Arial"/>
+            <w:kern w:val="0"/>
+            <w:sz w:val="21"/>
+            <w:szCs w:val="21"/>
+            <w:lang w:val="fr-FR" w:eastAsia="fr-FR"/>
+            <w14:ligatures w14:val="none"/>
+          </w:rPr>
+          <w:t>. Co</w:t>
+        </w:r>
+      </w:ins>
+      <w:del w:id="343" w:author="Ismael SAMBY" w:date="2026-08-10T16:21:00Z">
+        <w:r>
+          <w:rPr>
+            <w:rFonts w:ascii="Arial" w:eastAsia="Arial" w:hAnsi="Arial" w:cs="Arial"/>
+            <w:kern w:val="0"/>
+            <w:sz w:val="21"/>
+            <w:szCs w:val="21"/>
+            <w:lang w:val="fr-FR" w:eastAsia="fr-FR"/>
+            <w14:ligatures w14:val="none"/>
+          </w:rPr>
+          <w:delText xml:space="preserve"> ; co</w:delText>
+        </w:r>
+      </w:del>
+      <w:r>
+        <w:rPr>
+          <w:rFonts w:ascii="Arial" w:eastAsia="Arial" w:hAnsi="Arial" w:cs="Arial"/>
+          <w:kern w:val="0"/>
+          <w:sz w:val="21"/>
+          <w:szCs w:val="21"/>
+          <w:lang w:val="fr-FR" w:eastAsia="fr-FR"/>
+          <w14:ligatures w14:val="none"/>
+        </w:rPr>
+        <w:t>nformément au principe de proportionnalité retenu pour ce chapitre, les montants précis sont chiffrés dans le PGES.</w:t>
       </w:r>
     </w:p>
     <w:p>
@@ -16297,6 +17819,246 @@
     </w:sectPr>
   </w:body>
 </w:document>
+</file>
+
+<file path=word/comments.xml><?xml version="1.0" encoding="utf-8"?>
+<w:comments xmlns:wpc="http://schemas.microsoft.com/office/word/2010/wordprocessingCanvas" xmlns:cx="http://schemas.microsoft.com/office/drawing/2014/chartex" xmlns:cx1="http://schemas.microsoft.com/office/drawing/2015/9/8/chartex" xmlns:cx2="http://schemas.microsoft.com/office/drawing/2015/10/21/chartex" xmlns:cx3="http://schemas.microsoft.com/office/drawing/2016/5/9/chartex" xmlns:cx4="http://schemas.microsoft.com/office/drawing/2016/5/10/chartex" xmlns:cx5="http://schemas.microsoft.com/office/drawing/2016/5/11/chartex" xmlns:cx6="http://schemas.microsoft.com/office/drawing/2016/5/12/chartex" xmlns:cx7="http://schemas.microsoft.com/office/drawing/2016/5/13/chartex" xmlns:cx8="http://schemas.microsoft.com/office/drawing/2016/5/14/chartex" xmlns:mc="http://schemas.openxmlformats.org/markup-compatibility/2006" xmlns:aink="http://schemas.microsoft.com/office/drawing/2016/ink" xmlns:am3d="http://schemas.microsoft.com/office/drawing/2017/model3d" xmlns:o="urn:schemas-microsoft-com:office:office" xmlns:r="http://schemas.openxmlformats.org/officeDocument/2006/relationships" xmlns:m="http://schemas.openxmlformats.org/officeDocument/2006/math" xmlns:v="urn:schemas-microsoft-com:vml" xmlns:wp14="http://schemas.microsoft.com/office/word/2010/wordprocessingDrawing" xmlns:wp="http://schemas.openxmlformats.org/drawingml/2006/wordprocessingDrawing" xmlns:w10="urn:schemas-microsoft-com:office:word" xmlns:w="http://schemas.openxmlformats.org/wordprocessingml/2006/main" xmlns:w14="http://schemas.microsoft.com/office/word/2010/wordml" xmlns:w15="http://schemas.microsoft.com/office/word/2012/wordml" xmlns:w16cex="http://schemas.microsoft.com/office/word/2018/wordml/cex" xmlns:w16cid="http://schemas.microsoft.com/office/word/2016/wordml/cid" xmlns:w16="http://schemas.microsoft.com/office/word/2018/wordml" xmlns:w16sdtdh="http://schemas.microsoft.com/office/word/2020/wordml/sdtdatahash" xmlns:w16se="http://schemas.microsoft.com/office/word/2015/wordml/symex" xmlns:wpg="http://schemas.microsoft.com/office/word/2010/wordprocessingGroup" xmlns:wpi="http://schemas.microsoft.com/office/word/2010/wordprocessingInk" xmlns:wne="http://schemas.microsoft.com/office/word/2006/wordml" xmlns:wps="http://schemas.microsoft.com/office/word/2010/wordprocessingShape" mc:Ignorable="w14 w15 w16se w16cid w16 w16cex w16sdtdh wp14">
+  <w:comment w:id="19" w:author="Jerry Kalonji" w:date="2026-08-10T14:01:00Z" w:initials="JK">
+    <w:p>
+      <w:pPr>
+        <w:pStyle w:val="Commentaire"/>
+      </w:pPr>
+      <w:r>
+        <w:rPr>
+          <w:rStyle w:val="Marquedecommentaire"/>
+        </w:rPr>
+        <w:annotationRef/>
+      </w:r>
+      <w:r>
+        <w:t xml:space="preserve">Veuillez systématiquement </w:t>
+      </w:r>
+      <w:r>
+        <w:t>numéroter et intituler les tableaux.</w:t>
+      </w:r>
+    </w:p>
+  </w:comment>
+  <w:comment w:id="31" w:author="Jerry Kalonji" w:date="2026-08-10T14:01:00Z" w:initials="JK">
+    <w:p>
+      <w:pPr>
+        <w:pStyle w:val="Commentaire"/>
+      </w:pPr>
+      <w:r>
+        <w:rPr>
+          <w:rStyle w:val="Marquedecommentaire"/>
+        </w:rPr>
+        <w:annotationRef/>
+      </w:r>
+      <w:r>
+        <w:t>Veuillez systématiquement numéroter et intituler les tableaux.</w:t>
+      </w:r>
+    </w:p>
+  </w:comment>
+  <w:comment w:id="32" w:author="Ismael SAMBY" w:date="2026-08-10T16:29:00Z" w:initials="IS">
+    <w:p>
+      <w:pPr>
+        <w:pStyle w:val="Commentaire"/>
+      </w:pPr>
+      <w:r>
+        <w:rPr>
+          <w:rStyle w:val="Marquedecommentaire"/>
+        </w:rPr>
+        <w:annotationRef/>
+      </w:r>
+      <w:r>
+        <w:t>Ok</w:t>
+      </w:r>
+    </w:p>
+  </w:comment>
+  <w:comment w:id="156" w:author="Jerry Kalonji" w:date="2026-08-10T14:13:00Z" w:initials="JK">
+    <w:p>
+      <w:pPr>
+        <w:pStyle w:val="Commentaire"/>
+      </w:pPr>
+      <w:r>
+        <w:rPr>
+          <w:rStyle w:val="Marquedecommentaire"/>
+        </w:rPr>
+        <w:annotationRef/>
+      </w:r>
+      <w:r>
+        <w:t>Veuillez indiquer les biens du patrimoine culturel qui risquent d’être impactés par le projet : le savoir</w:t>
+      </w:r>
+      <w:r>
+        <w:t>-</w:t>
+      </w:r>
+      <w:r>
+        <w:t xml:space="preserve">faire </w:t>
+      </w:r>
+      <w:r>
+        <w:t xml:space="preserve">traditionnel </w:t>
+      </w:r>
+      <w:r>
+        <w:t>lié à la sal</w:t>
+      </w:r>
+      <w:r>
+        <w:t>iculture</w:t>
+      </w:r>
+      <w:r>
+        <w:t xml:space="preserve"> (comme les communautés risquent d’être éloignées des lieux où elles ramassent le sel)</w:t>
+      </w:r>
+      <w:r>
+        <w:t xml:space="preserve">, etc. </w:t>
+      </w:r>
+    </w:p>
+  </w:comment>
+  <w:comment w:id="157" w:author="Ismael SAMBY" w:date="2026-08-10T16:37:00Z" w:initials="IS">
+    <w:p>
+      <w:pPr>
+        <w:pStyle w:val="Commentaire"/>
+      </w:pPr>
+      <w:r>
+        <w:rPr>
+          <w:rStyle w:val="Marquedecommentaire"/>
+        </w:rPr>
+        <w:annotationRef/>
+      </w:r>
+      <w:r>
+        <w:t>Ok</w:t>
+      </w:r>
+    </w:p>
+  </w:comment>
+  <w:comment w:id="181" w:author="Jerry Kalonji" w:date="2026-08-10T14:13:00Z" w:initials="JK">
+    <w:p>
+      <w:pPr>
+        <w:pStyle w:val="Commentaire"/>
+      </w:pPr>
+      <w:r>
+        <w:rPr>
+          <w:rStyle w:val="Marquedecommentaire"/>
+        </w:rPr>
+        <w:annotationRef/>
+      </w:r>
+      <w:r>
+        <w:t xml:space="preserve">Ceci semble vide. </w:t>
+      </w:r>
+      <w:r>
+        <w:t>Une mosquée, en tant que bâtiment, n'est généralement pas considérée comme un bien du patrimoine culturel immatériel. Elle relève plutôt du patrimoine culturel matériel, puisqu'il s'agit d'un édifice physique.</w:t>
+      </w:r>
+    </w:p>
+  </w:comment>
+  <w:comment w:id="333" w:author="Jerry Kalonji" w:date="2026-08-10T14:41:00Z" w:initials="JK">
+    <w:p>
+      <w:pPr>
+        <w:pStyle w:val="Commentaire"/>
+      </w:pPr>
+      <w:r>
+        <w:rPr>
+          <w:rStyle w:val="Marquedecommentaire"/>
+        </w:rPr>
+        <w:annotationRef/>
+      </w:r>
+      <w:r>
+        <w:t>S’agit-il de la structure ou du contenu</w:t>
+      </w:r>
+      <w:r>
+        <w:t xml:space="preserve">? </w:t>
+      </w:r>
+    </w:p>
+  </w:comment>
+  <w:comment w:id="334" w:author="Ismael SAMBY" w:date="2026-08-10T16:20:00Z" w:initials="IS">
+    <w:p>
+      <w:pPr>
+        <w:pStyle w:val="Commentaire"/>
+      </w:pPr>
+      <w:r>
+        <w:rPr>
+          <w:rStyle w:val="Marquedecommentaire"/>
+        </w:rPr>
+        <w:annotationRef/>
+      </w:r>
+      <w:r>
+        <w:t>Ok</w:t>
+      </w:r>
+    </w:p>
+  </w:comment>
+  <w:comment w:id="339" w:author="Jerry Kalonji" w:date="2026-08-10T14:39:00Z" w:initials="JK">
+    <w:p>
+      <w:pPr>
+        <w:pStyle w:val="Commentaire"/>
+      </w:pPr>
+      <w:r>
+        <w:rPr>
+          <w:rStyle w:val="Marquedecommentaire"/>
+        </w:rPr>
+        <w:annotationRef/>
+      </w:r>
+      <w:r>
+        <w:t>Veuillez insérer le tableau concerné.</w:t>
+      </w:r>
+    </w:p>
+  </w:comment>
+  <w:comment w:id="340" w:author="Ismael SAMBY" w:date="2026-08-10T16:21:00Z" w:initials="IS">
+    <w:p>
+      <w:pPr>
+        <w:pStyle w:val="Commentaire"/>
+      </w:pPr>
+      <w:r>
+        <w:rPr>
+          <w:rStyle w:val="Marquedecommentaire"/>
+        </w:rPr>
+        <w:annotationRef/>
+      </w:r>
+      <w:r>
+        <w:t>Ok</w:t>
+      </w:r>
+    </w:p>
+  </w:comment>
+</w:comments>
+</file>
+
+<file path=word/commentsExtended.xml><?xml version="1.0" encoding="utf-8"?>
+<w15:commentsEx xmlns:wpc="http://schemas.microsoft.com/office/word/2010/wordprocessingCanvas" xmlns:cx="http://schemas.microsoft.com/office/drawing/2014/chartex" xmlns:cx1="http://schemas.microsoft.com/office/drawing/2015/9/8/chartex" xmlns:cx2="http://schemas.microsoft.com/office/drawing/2015/10/21/chartex" xmlns:cx3="http://schemas.microsoft.com/office/drawing/2016/5/9/chartex" xmlns:cx4="http://schemas.microsoft.com/office/drawing/2016/5/10/chartex" xmlns:cx5="http://schemas.microsoft.com/office/drawing/2016/5/11/chartex" xmlns:cx6="http://schemas.microsoft.com/office/drawing/2016/5/12/chartex" xmlns:cx7="http://schemas.microsoft.com/office/drawing/2016/5/13/chartex" xmlns:cx8="http://schemas.microsoft.com/office/drawing/2016/5/14/chartex" xmlns:mc="http://schemas.openxmlformats.org/markup-compatibility/2006" xmlns:aink="http://schemas.microsoft.com/office/drawing/2016/ink" xmlns:am3d="http://schemas.microsoft.com/office/drawing/2017/model3d" xmlns:o="urn:schemas-microsoft-com:office:office" xmlns:r="http://schemas.openxmlformats.org/officeDocument/2006/relationships" xmlns:m="http://schemas.openxmlformats.org/officeDocument/2006/math" xmlns:v="urn:schemas-microsoft-com:vml" xmlns:wp14="http://schemas.microsoft.com/office/word/2010/wordprocessingDrawing" xmlns:wp="http://schemas.openxmlformats.org/drawingml/2006/wordprocessingDrawing" xmlns:w10="urn:schemas-microsoft-com:office:word" xmlns:w="http://schemas.openxmlformats.org/wordprocessingml/2006/main" xmlns:w14="http://schemas.microsoft.com/office/word/2010/wordml" xmlns:w15="http://schemas.microsoft.com/office/word/2012/wordml" xmlns:w16cex="http://schemas.microsoft.com/office/word/2018/wordml/cex" xmlns:w16cid="http://schemas.microsoft.com/office/word/2016/wordml/cid" xmlns:w16="http://schemas.microsoft.com/office/word/2018/wordml" xmlns:w16sdtdh="http://schemas.microsoft.com/office/word/2020/wordml/sdtdatahash" xmlns:w16se="http://schemas.microsoft.com/office/word/2015/wordml/symex" xmlns:wpg="http://schemas.microsoft.com/office/word/2010/wordprocessingGroup" xmlns:wpi="http://schemas.microsoft.com/office/word/2010/wordprocessingInk" xmlns:wne="http://schemas.microsoft.com/office/word/2006/wordml" xmlns:wps="http://schemas.microsoft.com/office/word/2010/wordprocessingShape" mc:Ignorable="w14 w15 w16se w16cid w16 w16cex w16sdtdh wp14">
+  <w15:commentEx w15:paraId="685E54DC" w15:done="0"/>
+  <w15:commentEx w15:paraId="221B8BC6" w15:done="0"/>
+  <w15:commentEx w15:paraId="65AC9971" w15:paraIdParent="221B8BC6" w15:done="0"/>
+  <w15:commentEx w15:paraId="5966D76A" w15:done="0"/>
+  <w15:commentEx w15:paraId="7E29FE76" w15:paraIdParent="5966D76A" w15:done="0"/>
+  <w15:commentEx w15:paraId="72FF92D8" w15:done="0"/>
+  <w15:commentEx w15:paraId="64330D5B" w15:done="0"/>
+  <w15:commentEx w15:paraId="2E3A284F" w15:paraIdParent="64330D5B" w15:done="0"/>
+  <w15:commentEx w15:paraId="416F8007" w15:done="0"/>
+  <w15:commentEx w15:paraId="15679E89" w15:paraIdParent="416F8007" w15:done="0"/>
+</w15:commentsEx>
+</file>
+
+<file path=word/commentsExtensible.xml><?xml version="1.0" encoding="utf-8"?>
+<w16cex:commentsExtensible xmlns:wpc="http://schemas.microsoft.com/office/word/2010/wordprocessingCanvas" xmlns:cx="http://schemas.microsoft.com/office/drawing/2014/chartex" xmlns:cx1="http://schemas.microsoft.com/office/drawing/2015/9/8/chartex" xmlns:cx2="http://schemas.microsoft.com/office/drawing/2015/10/21/chartex" xmlns:cx3="http://schemas.microsoft.com/office/drawing/2016/5/9/chartex" xmlns:cx4="http://schemas.microsoft.com/office/drawing/2016/5/10/chartex" xmlns:cx5="http://schemas.microsoft.com/office/drawing/2016/5/11/chartex" xmlns:cx6="http://schemas.microsoft.com/office/drawing/2016/5/12/chartex" xmlns:cx7="http://schemas.microsoft.com/office/drawing/2016/5/13/chartex" xmlns:cx8="http://schemas.microsoft.com/office/drawing/2016/5/14/chartex" xmlns:mc="http://schemas.openxmlformats.org/markup-compatibility/2006" xmlns:aink="http://schemas.microsoft.com/office/drawing/2016/ink" xmlns:am3d="http://schemas.microsoft.com/office/drawing/2017/model3d" xmlns:o="urn:schemas-microsoft-com:office:office" xmlns:r="http://schemas.openxmlformats.org/officeDocument/2006/relationships" xmlns:m="http://schemas.openxmlformats.org/officeDocument/2006/math" xmlns:v="urn:schemas-microsoft-com:vml" xmlns:wp14="http://schemas.microsoft.com/office/word/2010/wordprocessingDrawing" xmlns:wp="http://schemas.openxmlformats.org/drawingml/2006/wordprocessingDrawing" xmlns:w10="urn:schemas-microsoft-com:office:word" xmlns:w="http://schemas.openxmlformats.org/wordprocessingml/2006/main" xmlns:w14="http://schemas.microsoft.com/office/word/2010/wordml" xmlns:w15="http://schemas.microsoft.com/office/word/2012/wordml" xmlns:w16cex="http://schemas.microsoft.com/office/word/2018/wordml/cex" xmlns:w16cid="http://schemas.microsoft.com/office/word/2016/wordml/cid" xmlns:w16="http://schemas.microsoft.com/office/word/2018/wordml" xmlns:w16sdtdh="http://schemas.microsoft.com/office/word/2020/wordml/sdtdatahash" xmlns:w16se="http://schemas.microsoft.com/office/word/2015/wordml/symex" xmlns:wpg="http://schemas.microsoft.com/office/word/2010/wordprocessingGroup" xmlns:wpi="http://schemas.microsoft.com/office/word/2010/wordprocessingInk" xmlns:wne="http://schemas.microsoft.com/office/word/2006/wordml" xmlns:wps="http://schemas.microsoft.com/office/word/2010/wordprocessingShape" mc:Ignorable="w14 w15 w16se w16cid w16 w16cex w16sdtdh wp14">
+  <w16cex:commentExtensible w16cex:durableId="627E2751" w16cex:dateUtc="2026-08-10T12:01:00Z"/>
+  <w16cex:commentExtensible w16cex:durableId="2E247988" w16cex:dateUtc="2026-08-10T12:01:00Z"/>
+  <w16cex:commentExtensible w16cex:durableId="2E247AEF" w16cex:dateUtc="2026-08-10T16:29:00Z"/>
+  <w16cex:commentExtensible w16cex:durableId="365C6896" w16cex:dateUtc="2026-08-10T12:13:00Z"/>
+  <w16cex:commentExtensible w16cex:durableId="2E247CD3" w16cex:dateUtc="2026-08-10T16:37:00Z"/>
+  <w16cex:commentExtensible w16cex:durableId="22085AA1" w16cex:dateUtc="2026-08-10T12:13:00Z"/>
+  <w16cex:commentExtensible w16cex:durableId="0E472268" w16cex:dateUtc="2026-08-10T12:41:00Z"/>
+  <w16cex:commentExtensible w16cex:durableId="2E2478DC" w16cex:dateUtc="2026-08-10T16:20:00Z"/>
+  <w16cex:commentExtensible w16cex:durableId="0887EFAF" w16cex:dateUtc="2026-08-10T12:39:00Z"/>
+  <w16cex:commentExtensible w16cex:durableId="2E247925" w16cex:dateUtc="2026-08-10T16:21:00Z"/>
+</w16cex:commentsExtensible>
+</file>
+
+<file path=word/commentsIds.xml><?xml version="1.0" encoding="utf-8"?>
+<w16cid:commentsIds xmlns:wpc="http://schemas.microsoft.com/office/word/2010/wordprocessingCanvas" xmlns:cx="http://schemas.microsoft.com/office/drawing/2014/chartex" xmlns:cx1="http://schemas.microsoft.com/office/drawing/2015/9/8/chartex" xmlns:cx2="http://schemas.microsoft.com/office/drawing/2015/10/21/chartex" xmlns:cx3="http://schemas.microsoft.com/office/drawing/2016/5/9/chartex" xmlns:cx4="http://schemas.microsoft.com/office/drawing/2016/5/10/chartex" xmlns:cx5="http://schemas.microsoft.com/office/drawing/2016/5/11/chartex" xmlns:cx6="http://schemas.microsoft.com/office/drawing/2016/5/12/chartex" xmlns:cx7="http://schemas.microsoft.com/office/drawing/2016/5/13/chartex" xmlns:cx8="http://schemas.microsoft.com/office/drawing/2016/5/14/chartex" xmlns:mc="http://schemas.openxmlformats.org/markup-compatibility/2006" xmlns:aink="http://schemas.microsoft.com/office/drawing/2016/ink" xmlns:am3d="http://schemas.microsoft.com/office/drawing/2017/model3d" xmlns:o="urn:schemas-microsoft-com:office:office" xmlns:r="http://schemas.openxmlformats.org/officeDocument/2006/relationships" xmlns:m="http://schemas.openxmlformats.org/officeDocument/2006/math" xmlns:v="urn:schemas-microsoft-com:vml" xmlns:wp14="http://schemas.microsoft.com/office/word/2010/wordprocessingDrawing" xmlns:wp="http://schemas.openxmlformats.org/drawingml/2006/wordprocessingDrawing" xmlns:w10="urn:schemas-microsoft-com:office:word" xmlns:w="http://schemas.openxmlformats.org/wordprocessingml/2006/main" xmlns:w14="http://schemas.microsoft.com/office/word/2010/wordml" xmlns:w15="http://schemas.microsoft.com/office/word/2012/wordml" xmlns:w16cex="http://schemas.microsoft.com/office/word/2018/wordml/cex" xmlns:w16cid="http://schemas.microsoft.com/office/word/2016/wordml/cid" xmlns:w16="http://schemas.microsoft.com/office/word/2018/wordml" xmlns:w16sdtdh="http://schemas.microsoft.com/office/word/2020/wordml/sdtdatahash" xmlns:w16se="http://schemas.microsoft.com/office/word/2015/wordml/symex" xmlns:wpg="http://schemas.microsoft.com/office/word/2010/wordprocessingGroup" xmlns:wpi="http://schemas.microsoft.com/office/word/2010/wordprocessingInk" xmlns:wne="http://schemas.microsoft.com/office/word/2006/wordml" xmlns:wps="http://schemas.microsoft.com/office/word/2010/wordprocessingShape" mc:Ignorable="w14 w15 w16se w16cid w16 w16cex w16sdtdh wp14">
+  <w16cid:commentId w16cid:paraId="685E54DC" w16cid:durableId="627E2751"/>
+  <w16cid:commentId w16cid:paraId="221B8BC6" w16cid:durableId="2E247988"/>
+  <w16cid:commentId w16cid:paraId="65AC9971" w16cid:durableId="2E247AEF"/>
+  <w16cid:commentId w16cid:paraId="5966D76A" w16cid:durableId="365C6896"/>
+  <w16cid:commentId w16cid:paraId="7E29FE76" w16cid:durableId="2E247CD3"/>
+  <w16cid:commentId w16cid:paraId="72FF92D8" w16cid:durableId="22085AA1"/>
+  <w16cid:commentId w16cid:paraId="64330D5B" w16cid:durableId="0E472268"/>
+  <w16cid:commentId w16cid:paraId="2E3A284F" w16cid:durableId="2E2478DC"/>
+  <w16cid:commentId w16cid:paraId="416F8007" w16cid:durableId="0887EFAF"/>
+  <w16cid:commentId w16cid:paraId="15679E89" w16cid:durableId="2E247925"/>
+</w16cid:commentsIds>
 </file>
 
 <file path=word/numbering.xml><?xml version="1.0" encoding="utf-8"?>
@@ -18890,6 +20652,17 @@
     <w:abstractNumId w:val="1"/>
   </w:num>
 </w:numbering>
+</file>
+
+<file path=word/people.xml><?xml version="1.0" encoding="utf-8"?>
+<w15:people xmlns:wpc="http://schemas.microsoft.com/office/word/2010/wordprocessingCanvas" xmlns:cx="http://schemas.microsoft.com/office/drawing/2014/chartex" xmlns:cx1="http://schemas.microsoft.com/office/drawing/2015/9/8/chartex" xmlns:cx2="http://schemas.microsoft.com/office/drawing/2015/10/21/chartex" xmlns:cx3="http://schemas.microsoft.com/office/drawing/2016/5/9/chartex" xmlns:cx4="http://schemas.microsoft.com/office/drawing/2016/5/10/chartex" xmlns:cx5="http://schemas.microsoft.com/office/drawing/2016/5/11/chartex" xmlns:cx6="http://schemas.microsoft.com/office/drawing/2016/5/12/chartex" xmlns:cx7="http://schemas.microsoft.com/office/drawing/2016/5/13/chartex" xmlns:cx8="http://schemas.microsoft.com/office/drawing/2016/5/14/chartex" xmlns:mc="http://schemas.openxmlformats.org/markup-compatibility/2006" xmlns:aink="http://schemas.microsoft.com/office/drawing/2016/ink" xmlns:am3d="http://schemas.microsoft.com/office/drawing/2017/model3d" xmlns:o="urn:schemas-microsoft-com:office:office" xmlns:r="http://schemas.openxmlformats.org/officeDocument/2006/relationships" xmlns:m="http://schemas.openxmlformats.org/officeDocument/2006/math" xmlns:v="urn:schemas-microsoft-com:vml" xmlns:wp14="http://schemas.microsoft.com/office/word/2010/wordprocessingDrawing" xmlns:wp="http://schemas.openxmlformats.org/drawingml/2006/wordprocessingDrawing" xmlns:w10="urn:schemas-microsoft-com:office:word" xmlns:w="http://schemas.openxmlformats.org/wordprocessingml/2006/main" xmlns:w14="http://schemas.microsoft.com/office/word/2010/wordml" xmlns:w15="http://schemas.microsoft.com/office/word/2012/wordml" xmlns:w16cex="http://schemas.microsoft.com/office/word/2018/wordml/cex" xmlns:w16cid="http://schemas.microsoft.com/office/word/2016/wordml/cid" xmlns:w16="http://schemas.microsoft.com/office/word/2018/wordml" xmlns:w16sdtdh="http://schemas.microsoft.com/office/word/2020/wordml/sdtdatahash" xmlns:w16se="http://schemas.microsoft.com/office/word/2015/wordml/symex" xmlns:wpg="http://schemas.microsoft.com/office/word/2010/wordprocessingGroup" xmlns:wpi="http://schemas.microsoft.com/office/word/2010/wordprocessingInk" xmlns:wne="http://schemas.microsoft.com/office/word/2006/wordml" xmlns:wps="http://schemas.microsoft.com/office/word/2010/wordprocessingShape" mc:Ignorable="w14 w15 w16se w16cid w16 w16cex w16sdtdh wp14">
+  <w15:person w15:author="Ismael SAMBY">
+    <w15:presenceInfo w15:providerId="Windows Live" w15:userId="0ddd6c292a4ed5d0"/>
+  </w15:person>
+  <w15:person w15:author="Jerry Kalonji">
+    <w15:presenceInfo w15:providerId="Windows Live" w15:userId="fdbf5c76d981535b"/>
+  </w15:person>
+</w15:people>
 </file>
 
 <file path=word/styles.xml><?xml version="1.0" encoding="utf-8"?>

</xml_diff>